<commit_message>
docs: update all certificates on 'as0001'
</commit_message>
<xml_diff>
--- a/atestados-servicos/as0001-eng-gustavo-josé-elias-batista-oliveira-crea-1614317240/asd001-conc00004-2024/ATESTADO0004_2024.docx
+++ b/atestados-servicos/as0001-eng-gustavo-josé-elias-batista-oliveira-crea-1614317240/asd001-conc00004-2024/ATESTADO0004_2024.docx
@@ -1,6 +1,6 @@
 
 <file path=word/document.xml><?xml version="1.0" encoding="utf-8"?>
-<w:document xmlns:wpc="http://schemas.microsoft.com/office/word/2010/wordprocessingCanvas" xmlns:cx="http://schemas.microsoft.com/office/drawing/2014/chartex" xmlns:cx1="http://schemas.microsoft.com/office/drawing/2015/9/8/chartex" xmlns:cx2="http://schemas.microsoft.com/office/drawing/2015/10/21/chartex" xmlns:cx3="http://schemas.microsoft.com/office/drawing/2016/5/9/chartex" xmlns:cx4="http://schemas.microsoft.com/office/drawing/2016/5/10/chartex" xmlns:cx5="http://schemas.microsoft.com/office/drawing/2016/5/11/chartex" xmlns:cx6="http://schemas.microsoft.com/office/drawing/2016/5/12/chartex" xmlns:cx7="http://schemas.microsoft.com/office/drawing/2016/5/13/chartex" xmlns:cx8="http://schemas.microsoft.com/office/drawing/2016/5/14/chartex" xmlns:mc="http://schemas.openxmlformats.org/markup-compatibility/2006" xmlns:aink="http://schemas.microsoft.com/office/drawing/2016/ink" xmlns:am3d="http://schemas.microsoft.com/office/drawing/2017/model3d" xmlns:o="urn:schemas-microsoft-com:office:office" xmlns:oel="http://schemas.microsoft.com/office/2019/extlst" xmlns:r="http://schemas.openxmlformats.org/officeDocument/2006/relationships" xmlns:m="http://schemas.openxmlformats.org/officeDocument/2006/math" xmlns:v="urn:schemas-microsoft-com:vml" xmlns:wp14="http://schemas.microsoft.com/office/word/2010/wordprocessingDrawing" xmlns:wp="http://schemas.openxmlformats.org/drawingml/2006/wordprocessingDrawing" xmlns:w10="urn:schemas-microsoft-com:office:word" xmlns:w="http://schemas.openxmlformats.org/wordprocessingml/2006/main" xmlns:w14="http://schemas.microsoft.com/office/word/2010/wordml" xmlns:w15="http://schemas.microsoft.com/office/word/2012/wordml" xmlns:w16cex="http://schemas.microsoft.com/office/word/2018/wordml/cex" xmlns:w16cid="http://schemas.microsoft.com/office/word/2016/wordml/cid" xmlns:w16="http://schemas.microsoft.com/office/word/2018/wordml" xmlns:w16du="http://schemas.microsoft.com/office/word/2023/wordml/word16du" xmlns:w16sdtdh="http://schemas.microsoft.com/office/word/2020/wordml/sdtdatahash" xmlns:w16sdtfl="http://schemas.microsoft.com/office/word/2024/wordml/sdtformatlock" xmlns:w16se="http://schemas.microsoft.com/office/word/2015/wordml/symex" xmlns:wpg="http://schemas.microsoft.com/office/word/2010/wordprocessingGroup" xmlns:wpi="http://schemas.microsoft.com/office/word/2010/wordprocessingInk" xmlns:wne="http://schemas.microsoft.com/office/word/2006/wordml" xmlns:wps="http://schemas.microsoft.com/office/word/2010/wordprocessingShape" xmlns:a="http://schemas.openxmlformats.org/drawingml/2006/main" xmlns:a14="http://schemas.microsoft.com/office/drawing/2010/main" xmlns:pic="http://schemas.openxmlformats.org/drawingml/2006/picture" mc:Ignorable="w14 w15 w16se w16cid w16 w16cex w16sdtdh w16sdtfl w16du wp14">
+<w:document xmlns:wpc="http://schemas.microsoft.com/office/word/2010/wordprocessingCanvas" xmlns:cx="http://schemas.microsoft.com/office/drawing/2014/chartex" xmlns:cx1="http://schemas.microsoft.com/office/drawing/2015/9/8/chartex" xmlns:cx2="http://schemas.microsoft.com/office/drawing/2015/10/21/chartex" xmlns:cx3="http://schemas.microsoft.com/office/drawing/2016/5/9/chartex" xmlns:cx4="http://schemas.microsoft.com/office/drawing/2016/5/10/chartex" xmlns:cx5="http://schemas.microsoft.com/office/drawing/2016/5/11/chartex" xmlns:cx6="http://schemas.microsoft.com/office/drawing/2016/5/12/chartex" xmlns:cx7="http://schemas.microsoft.com/office/drawing/2016/5/13/chartex" xmlns:cx8="http://schemas.microsoft.com/office/drawing/2016/5/14/chartex" xmlns:mc="http://schemas.openxmlformats.org/markup-compatibility/2006" xmlns:aink="http://schemas.microsoft.com/office/drawing/2016/ink" xmlns:am3d="http://schemas.microsoft.com/office/drawing/2017/model3d" xmlns:o="urn:schemas-microsoft-com:office:office" xmlns:r="http://schemas.openxmlformats.org/officeDocument/2006/relationships" xmlns:m="http://schemas.openxmlformats.org/officeDocument/2006/math" xmlns:v="urn:schemas-microsoft-com:vml" xmlns:wp14="http://schemas.microsoft.com/office/word/2010/wordprocessingDrawing" xmlns:wp="http://schemas.openxmlformats.org/drawingml/2006/wordprocessingDrawing" xmlns:w10="urn:schemas-microsoft-com:office:word" xmlns:w="http://schemas.openxmlformats.org/wordprocessingml/2006/main" xmlns:w14="http://schemas.microsoft.com/office/word/2010/wordml" xmlns:w15="http://schemas.microsoft.com/office/word/2012/wordml" xmlns:w16cex="http://schemas.microsoft.com/office/word/2018/wordml/cex" xmlns:w16cid="http://schemas.microsoft.com/office/word/2016/wordml/cid" xmlns:w16="http://schemas.microsoft.com/office/word/2018/wordml" xmlns:w16sdtdh="http://schemas.microsoft.com/office/word/2020/wordml/sdtdatahash" xmlns:w16se="http://schemas.microsoft.com/office/word/2015/wordml/symex" xmlns:wpg="http://schemas.microsoft.com/office/word/2010/wordprocessingGroup" xmlns:wpi="http://schemas.microsoft.com/office/word/2010/wordprocessingInk" xmlns:wne="http://schemas.microsoft.com/office/word/2006/wordml" xmlns:wps="http://schemas.microsoft.com/office/word/2010/wordprocessingShape" mc:Ignorable="w14 w15 w16se w16cid w16 w16cex w16sdtdh wp14">
   <w:body>
     <w:p>
       <w:pPr>
@@ -65,7 +65,7 @@
         <w:pStyle w:val="PargrafodaLista"/>
         <w:numPr>
           <w:ilvl w:val="0"/>
-          <w:numId w:val="3"/>
+          <w:numId w:val="5"/>
         </w:numPr>
         <w:spacing w:before="179" w:after="5"/>
         <w:ind w:right="116"/>
@@ -460,7 +460,6 @@
           <w:tcPr>
             <w:tcW w:w="8646" w:type="dxa"/>
             <w:shd w:val="clear" w:color="auto" w:fill="D9D9D9" w:themeFill="background1" w:themeFillShade="D9"/>
-            <w:tcMar/>
             <w:vAlign w:val="center"/>
           </w:tcPr>
           <w:p>
@@ -604,7 +603,6 @@
         <w:tc>
           <w:tcPr>
             <w:tcW w:w="8646" w:type="dxa"/>
-            <w:tcMar/>
           </w:tcPr>
           <w:p>
             <w:pPr>
@@ -627,7 +625,6 @@
         <w:tc>
           <w:tcPr>
             <w:tcW w:w="8646" w:type="dxa"/>
-            <w:tcMar/>
           </w:tcPr>
           <w:p>
             <w:pPr>
@@ -644,8 +641,8 @@
             <w:r>
               <w:rPr>
                 <w:rFonts w:ascii="Arial Narrow" w:hAnsi="Arial Narrow"/>
-                <w:b w:val="1"/>
-                <w:bCs w:val="1"/>
+                <w:b/>
+                <w:bCs/>
                 <w:sz w:val="24"/>
                 <w:szCs w:val="24"/>
               </w:rPr>
@@ -654,8 +651,8 @@
             <w:r>
               <w:rPr>
                 <w:rFonts w:ascii="Arial Narrow" w:hAnsi="Arial Narrow"/>
-                <w:b w:val="1"/>
-                <w:bCs w:val="1"/>
+                <w:b/>
+                <w:bCs/>
                 <w:spacing w:val="76"/>
                 <w:sz w:val="24"/>
                 <w:szCs w:val="24"/>
@@ -665,8 +662,8 @@
             <w:r>
               <w:rPr>
                 <w:rFonts w:ascii="Arial Narrow" w:hAnsi="Arial Narrow"/>
-                <w:b w:val="1"/>
-                <w:bCs w:val="1"/>
+                <w:b/>
+                <w:bCs/>
                 <w:spacing w:val="76"/>
                 <w:sz w:val="24"/>
                 <w:szCs w:val="24"/>
@@ -727,880 +724,6 @@
                 <w:shd w:val="clear" w:color="auto" w:fill="FFFFFF"/>
               </w:rPr>
               <w:t>06/2024</w:t>
-            </w:r>
-          </w:p>
-          <w:p>
-            <w:pPr>
-              <w:pStyle w:val="TableParagraph"/>
-              <w:numPr>
-                <w:ilvl w:val="0"/>
-                <w:numId w:val="2"/>
-              </w:numPr>
-              <w:tabs>
-                <w:tab w:val="left" w:pos="748"/>
-              </w:tabs>
-              <w:spacing w:before="7" w:line="237" w:lineRule="auto"/>
-              <w:ind w:right="106"/>
-              <w:jc w:val="both"/>
-              <w:rPr>
-                <w:rFonts w:ascii="Arial Narrow" w:hAnsi="Arial Narrow" w:eastAsia="Courier New" w:cs="Courier New"/>
-                <w:b w:val="1"/>
-                <w:bCs w:val="1"/>
-                <w:noProof w:val="0"/>
-                <w:sz w:val="24"/>
-                <w:szCs w:val="24"/>
-                <w:lang w:val="pt-PT"/>
-              </w:rPr>
-            </w:pPr>
-            <w:r>
-              <w:rPr>
-                <w:rFonts w:ascii="Arial Narrow" w:hAnsi="Arial Narrow"/>
-                <w:sz w:val="24"/>
-                <w:szCs w:val="24"/>
-              </w:rPr>
-              <w:t>Objeto do contrato:</w:t>
-            </w:r>
-            <w:r>
-              <w:rPr>
-                <w:rFonts w:ascii="Arial Narrow" w:hAnsi="Arial Narrow"/>
-                <w:sz w:val="24"/>
-                <w:szCs w:val="24"/>
-              </w:rPr>
-              <w:t xml:space="preserve"> </w:t>
-            </w:r>
-            <w:r>
-              <w:rPr>
-                <w:rFonts w:ascii="Arial Narrow" w:hAnsi="Arial Narrow" w:eastAsia="Courier New" w:cs="Courier New"/>
-                <w:b w:val="1"/>
-                <w:bCs w:val="1"/>
-                <w:noProof w:val="0"/>
-                <w:sz w:val="24"/>
-                <w:szCs w:val="24"/>
-                <w:lang w:val="pt-PT"/>
-              </w:rPr>
-              <w:t>Elaboração de Projeto, orçamento e especificações do CEASM - CENTRO ESPECIALIZADO DE ATENÇÃO À SAÚDE MENTAL com área de 467,04 m² para a cidade de Coremas – PB.</w:t>
-            </w:r>
-          </w:p>
-          <w:p>
-            <w:pPr>
-              <w:pStyle w:val="TableParagraph"/>
-              <w:numPr>
-                <w:ilvl w:val="0"/>
-                <w:numId w:val="2"/>
-              </w:numPr>
-              <w:tabs>
-                <w:tab w:val="left" w:pos="748"/>
-              </w:tabs>
-              <w:spacing w:before="3"/>
-              <w:jc w:val="both"/>
-              <w:rPr>
-                <w:rFonts w:ascii="Arial Narrow" w:hAnsi="Arial Narrow" w:eastAsia="Courier New" w:cs="Courier New"/>
-                <w:b w:val="1"/>
-                <w:bCs w:val="1"/>
-                <w:i w:val="0"/>
-                <w:iCs w:val="0"/>
-                <w:caps w:val="0"/>
-                <w:smallCaps w:val="0"/>
-                <w:noProof w:val="0"/>
-                <w:sz w:val="24"/>
-                <w:szCs w:val="24"/>
-                <w:lang w:val="pt-PT"/>
-              </w:rPr>
-            </w:pPr>
-            <w:r>
-              <w:rPr>
-                <w:rFonts w:ascii="Arial Narrow" w:hAnsi="Arial Narrow"/>
-                <w:sz w:val="24"/>
-                <w:szCs w:val="24"/>
-              </w:rPr>
-              <w:t>Endereço</w:t>
-            </w:r>
-            <w:r>
-              <w:rPr>
-                <w:rFonts w:ascii="Arial Narrow" w:hAnsi="Arial Narrow"/>
-                <w:spacing w:val="-1"/>
-                <w:sz w:val="24"/>
-                <w:szCs w:val="24"/>
-              </w:rPr>
-              <w:t xml:space="preserve"> </w:t>
-            </w:r>
-            <w:r>
-              <w:rPr>
-                <w:rFonts w:ascii="Arial Narrow" w:hAnsi="Arial Narrow"/>
-                <w:sz w:val="24"/>
-                <w:szCs w:val="24"/>
-              </w:rPr>
-              <w:t>da</w:t>
-            </w:r>
-            <w:r>
-              <w:rPr>
-                <w:rFonts w:ascii="Arial Narrow" w:hAnsi="Arial Narrow"/>
-                <w:sz w:val="24"/>
-                <w:szCs w:val="24"/>
-              </w:rPr>
-              <w:t>(</w:t>
-            </w:r>
-            <w:r>
-              <w:rPr>
-                <w:rFonts w:ascii="Arial Narrow" w:hAnsi="Arial Narrow"/>
-                <w:sz w:val="24"/>
-                <w:szCs w:val="24"/>
-              </w:rPr>
-              <w:t>s</w:t>
-            </w:r>
-            <w:r>
-              <w:rPr>
-                <w:rFonts w:ascii="Arial Narrow" w:hAnsi="Arial Narrow"/>
-                <w:sz w:val="24"/>
-                <w:szCs w:val="24"/>
-              </w:rPr>
-              <w:t>)</w:t>
-            </w:r>
-            <w:r>
-              <w:rPr>
-                <w:rFonts w:ascii="Arial Narrow" w:hAnsi="Arial Narrow"/>
-                <w:spacing w:val="4"/>
-                <w:sz w:val="24"/>
-                <w:szCs w:val="24"/>
-              </w:rPr>
-              <w:t xml:space="preserve"> </w:t>
-            </w:r>
-            <w:r>
-              <w:rPr>
-                <w:rFonts w:ascii="Arial Narrow" w:hAnsi="Arial Narrow"/>
-                <w:i w:val="1"/>
-                <w:iCs w:val="1"/>
-                <w:sz w:val="24"/>
-                <w:szCs w:val="24"/>
-                <w:u w:val="thick"/>
-              </w:rPr>
-              <w:t>obra</w:t>
-            </w:r>
-            <w:r>
-              <w:rPr>
-                <w:rFonts w:ascii="Arial Narrow" w:hAnsi="Arial Narrow"/>
-                <w:i w:val="1"/>
-                <w:iCs w:val="1"/>
-                <w:sz w:val="24"/>
-                <w:szCs w:val="24"/>
-                <w:u w:val="thick"/>
-              </w:rPr>
-              <w:t>(</w:t>
-            </w:r>
-            <w:r>
-              <w:rPr>
-                <w:rFonts w:ascii="Arial Narrow" w:hAnsi="Arial Narrow"/>
-                <w:i w:val="1"/>
-                <w:iCs w:val="1"/>
-                <w:sz w:val="24"/>
-                <w:szCs w:val="24"/>
-                <w:u w:val="thick"/>
-              </w:rPr>
-              <w:t>s</w:t>
-            </w:r>
-            <w:r>
-              <w:rPr>
-                <w:rFonts w:ascii="Arial Narrow" w:hAnsi="Arial Narrow"/>
-                <w:i w:val="1"/>
-                <w:iCs w:val="1"/>
-                <w:sz w:val="24"/>
-                <w:szCs w:val="24"/>
-                <w:u w:val="thick"/>
-              </w:rPr>
-              <w:t>)</w:t>
-            </w:r>
-            <w:r>
-              <w:rPr>
-                <w:rFonts w:ascii="Arial Narrow" w:hAnsi="Arial Narrow"/>
-                <w:i w:val="1"/>
-                <w:iCs w:val="1"/>
-                <w:spacing w:val="-1"/>
-                <w:sz w:val="24"/>
-                <w:szCs w:val="24"/>
-                <w:u w:val="thick"/>
-              </w:rPr>
-              <w:t xml:space="preserve"> </w:t>
-            </w:r>
-            <w:r>
-              <w:rPr>
-                <w:rFonts w:ascii="Arial Narrow" w:hAnsi="Arial Narrow"/>
-                <w:i w:val="1"/>
-                <w:iCs w:val="1"/>
-                <w:sz w:val="24"/>
-                <w:szCs w:val="24"/>
-                <w:u w:val="thick"/>
-              </w:rPr>
-              <w:t>ou</w:t>
-            </w:r>
-            <w:r>
-              <w:rPr>
-                <w:rFonts w:ascii="Arial Narrow" w:hAnsi="Arial Narrow"/>
-                <w:i w:val="1"/>
-                <w:iCs w:val="1"/>
-                <w:spacing w:val="-1"/>
-                <w:sz w:val="24"/>
-                <w:szCs w:val="24"/>
-                <w:u w:val="thick"/>
-              </w:rPr>
-              <w:t xml:space="preserve"> </w:t>
-            </w:r>
-            <w:r>
-              <w:rPr>
-                <w:rFonts w:ascii="Arial Narrow" w:hAnsi="Arial Narrow"/>
-                <w:i w:val="1"/>
-                <w:iCs w:val="1"/>
-                <w:sz w:val="24"/>
-                <w:szCs w:val="24"/>
-                <w:u w:val="thick"/>
-              </w:rPr>
-              <w:t>serviço</w:t>
-            </w:r>
-            <w:r>
-              <w:rPr>
-                <w:rFonts w:ascii="Arial Narrow" w:hAnsi="Arial Narrow"/>
-                <w:i w:val="1"/>
-                <w:iCs w:val="1"/>
-                <w:spacing w:val="-1"/>
-                <w:sz w:val="24"/>
-                <w:szCs w:val="24"/>
-                <w:u w:val="thick"/>
-              </w:rPr>
-              <w:t xml:space="preserve"> </w:t>
-            </w:r>
-            <w:r>
-              <w:rPr>
-                <w:rFonts w:ascii="Arial Narrow" w:hAnsi="Arial Narrow"/>
-                <w:i w:val="1"/>
-                <w:iCs w:val="1"/>
-                <w:sz w:val="24"/>
-                <w:szCs w:val="24"/>
-                <w:u w:val="thick"/>
-              </w:rPr>
-              <w:t>técnico</w:t>
-            </w:r>
-            <w:r>
-              <w:rPr>
-                <w:rFonts w:ascii="Arial Narrow" w:hAnsi="Arial Narrow"/>
-                <w:sz w:val="24"/>
-                <w:szCs w:val="24"/>
-              </w:rPr>
-              <w:t>:</w:t>
-            </w:r>
-            <w:bookmarkStart w:name="_Hlk201050284" w:id="0"/>
-            <w:r>
-              <w:rPr>
-                <w:rFonts w:ascii="Arial Narrow" w:hAnsi="Arial Narrow"/>
-                <w:b w:val="1"/>
-                <w:bCs w:val="1"/>
-                <w:spacing w:val="2"/>
-                <w:sz w:val="24"/>
-                <w:szCs w:val="24"/>
-              </w:rPr>
-              <w:t xml:space="preserve"> </w:t>
-            </w:r>
-            <w:r>
-              <w:rPr>
-                <w:rFonts w:ascii="Arial Narrow" w:hAnsi="Arial Narrow" w:eastAsia="Courier New" w:cs="Courier New"/>
-                <w:b w:val="1"/>
-                <w:bCs w:val="1"/>
-                <w:i w:val="0"/>
-                <w:iCs w:val="0"/>
-                <w:caps w:val="0"/>
-                <w:smallCaps w:val="0"/>
-                <w:noProof w:val="0"/>
-                <w:sz w:val="24"/>
-                <w:szCs w:val="24"/>
-                <w:lang w:val="pt-PT"/>
-              </w:rPr>
-              <w:t>Rua Maria Farias de Assis</w:t>
-            </w:r>
-            <w:r>
-              <w:rPr>
-                <w:rFonts w:ascii="Arial Narrow" w:hAnsi="Arial Narrow" w:eastAsia="Courier New" w:cs="Courier New"/>
-                <w:b w:val="1"/>
-                <w:bCs w:val="1"/>
-                <w:i w:val="0"/>
-                <w:iCs w:val="0"/>
-                <w:caps w:val="0"/>
-                <w:smallCaps w:val="0"/>
-                <w:noProof w:val="0"/>
-                <w:sz w:val="24"/>
-                <w:szCs w:val="24"/>
-                <w:lang w:val="pt-PT"/>
-              </w:rPr>
-              <w:t>, Estação da Luz</w:t>
-            </w:r>
-          </w:p>
-          <w:bookmarkEnd w:id="0"/>
-          <w:p>
-            <w:pPr>
-              <w:pStyle w:val="TableParagraph"/>
-              <w:numPr>
-                <w:ilvl w:val="0"/>
-                <w:numId w:val="2"/>
-              </w:numPr>
-              <w:tabs>
-                <w:tab w:val="left" w:pos="748"/>
-              </w:tabs>
-              <w:spacing w:before="1"/>
-              <w:ind w:right="103"/>
-              <w:jc w:val="both"/>
-              <w:rPr>
-                <w:rFonts w:ascii="Arial Narrow" w:hAnsi="Arial Narrow"/>
-                <w:b/>
-                <w:sz w:val="24"/>
-                <w:szCs w:val="24"/>
-              </w:rPr>
-            </w:pPr>
-            <w:r>
-              <w:rPr>
-                <w:rFonts w:ascii="Arial Narrow" w:hAnsi="Arial Narrow"/>
-                <w:sz w:val="24"/>
-                <w:szCs w:val="24"/>
-              </w:rPr>
-              <w:t>Empresa</w:t>
-            </w:r>
-            <w:r>
-              <w:rPr>
-                <w:rFonts w:ascii="Arial Narrow" w:hAnsi="Arial Narrow"/>
-                <w:spacing w:val="1"/>
-                <w:sz w:val="24"/>
-                <w:szCs w:val="24"/>
-              </w:rPr>
-              <w:t xml:space="preserve"> </w:t>
-            </w:r>
-            <w:r>
-              <w:rPr>
-                <w:rFonts w:ascii="Arial Narrow" w:hAnsi="Arial Narrow"/>
-                <w:sz w:val="24"/>
-                <w:szCs w:val="24"/>
-              </w:rPr>
-              <w:t xml:space="preserve">contratada: </w:t>
-            </w:r>
-            <w:r>
-              <w:rPr>
-                <w:rFonts w:ascii="Arial Narrow" w:hAnsi="Arial Narrow"/>
-                <w:b/>
-                <w:sz w:val="24"/>
-                <w:szCs w:val="24"/>
-              </w:rPr>
-              <w:t>Gustavo José Elias Batista Oliveira-ME</w:t>
-            </w:r>
-            <w:r>
-              <w:rPr>
-                <w:rFonts w:ascii="Arial Narrow" w:hAnsi="Arial Narrow"/>
-                <w:b/>
-                <w:sz w:val="24"/>
-                <w:szCs w:val="24"/>
-              </w:rPr>
-              <w:t xml:space="preserve"> CNPJ: </w:t>
-            </w:r>
-            <w:r>
-              <w:rPr>
-                <w:rFonts w:ascii="Arial Narrow" w:hAnsi="Arial Narrow"/>
-                <w:b/>
-                <w:sz w:val="24"/>
-                <w:szCs w:val="24"/>
-              </w:rPr>
-              <w:t>27</w:t>
-            </w:r>
-            <w:r>
-              <w:rPr>
-                <w:rFonts w:ascii="Arial Narrow" w:hAnsi="Arial Narrow"/>
-                <w:b/>
-                <w:sz w:val="24"/>
-                <w:szCs w:val="24"/>
-              </w:rPr>
-              <w:t>.</w:t>
-            </w:r>
-            <w:r>
-              <w:rPr>
-                <w:rFonts w:ascii="Arial Narrow" w:hAnsi="Arial Narrow"/>
-                <w:b/>
-                <w:sz w:val="24"/>
-                <w:szCs w:val="24"/>
-              </w:rPr>
-              <w:t>555</w:t>
-            </w:r>
-            <w:r>
-              <w:rPr>
-                <w:rFonts w:ascii="Arial Narrow" w:hAnsi="Arial Narrow"/>
-                <w:b/>
-                <w:sz w:val="24"/>
-                <w:szCs w:val="24"/>
-              </w:rPr>
-              <w:t>.</w:t>
-            </w:r>
-            <w:r>
-              <w:rPr>
-                <w:rFonts w:ascii="Arial Narrow" w:hAnsi="Arial Narrow"/>
-                <w:b/>
-                <w:sz w:val="24"/>
-                <w:szCs w:val="24"/>
-              </w:rPr>
-              <w:t>3</w:t>
-            </w:r>
-            <w:r>
-              <w:rPr>
-                <w:rFonts w:ascii="Arial Narrow" w:hAnsi="Arial Narrow"/>
-                <w:b/>
-                <w:sz w:val="24"/>
-                <w:szCs w:val="24"/>
-              </w:rPr>
-              <w:t>8</w:t>
-            </w:r>
-            <w:r>
-              <w:rPr>
-                <w:rFonts w:ascii="Arial Narrow" w:hAnsi="Arial Narrow"/>
-                <w:b/>
-                <w:sz w:val="24"/>
-                <w:szCs w:val="24"/>
-              </w:rPr>
-              <w:t>9</w:t>
-            </w:r>
-            <w:r>
-              <w:rPr>
-                <w:rFonts w:ascii="Arial Narrow" w:hAnsi="Arial Narrow"/>
-                <w:b/>
-                <w:sz w:val="24"/>
-                <w:szCs w:val="24"/>
-              </w:rPr>
-              <w:t>/0001-</w:t>
-            </w:r>
-            <w:r>
-              <w:rPr>
-                <w:rFonts w:ascii="Arial Narrow" w:hAnsi="Arial Narrow"/>
-                <w:b/>
-                <w:sz w:val="24"/>
-                <w:szCs w:val="24"/>
-              </w:rPr>
-              <w:t>98</w:t>
-            </w:r>
-            <w:r>
-              <w:rPr>
-                <w:rFonts w:ascii="Arial Narrow" w:hAnsi="Arial Narrow"/>
-                <w:b/>
-                <w:sz w:val="24"/>
-                <w:szCs w:val="24"/>
-              </w:rPr>
-              <w:t>.</w:t>
-            </w:r>
-          </w:p>
-          <w:p>
-            <w:pPr>
-              <w:pStyle w:val="TableParagraph"/>
-              <w:numPr>
-                <w:ilvl w:val="0"/>
-                <w:numId w:val="2"/>
-              </w:numPr>
-              <w:tabs>
-                <w:tab w:val="left" w:pos="748"/>
-              </w:tabs>
-              <w:spacing w:before="1"/>
-              <w:ind w:right="103"/>
-              <w:jc w:val="both"/>
-              <w:rPr>
-                <w:rFonts w:ascii="Arial Narrow" w:hAnsi="Arial Narrow"/>
-                <w:b/>
-                <w:sz w:val="24"/>
-                <w:szCs w:val="24"/>
-              </w:rPr>
-            </w:pPr>
-            <w:r>
-              <w:rPr>
-                <w:rFonts w:ascii="Arial Narrow" w:hAnsi="Arial Narrow"/>
-                <w:sz w:val="24"/>
-                <w:szCs w:val="24"/>
-              </w:rPr>
-              <w:t>Contratante e Proprietário da (</w:t>
-            </w:r>
-            <w:r>
-              <w:rPr>
-                <w:rFonts w:ascii="Arial Narrow" w:hAnsi="Arial Narrow"/>
-                <w:i/>
-                <w:sz w:val="24"/>
-                <w:szCs w:val="24"/>
-                <w:u w:val="thick"/>
-              </w:rPr>
-              <w:t>obra ou serviço técnico</w:t>
-            </w:r>
-            <w:r>
-              <w:rPr>
-                <w:rFonts w:ascii="Arial Narrow" w:hAnsi="Arial Narrow"/>
-                <w:sz w:val="24"/>
-                <w:szCs w:val="24"/>
-              </w:rPr>
-              <w:t xml:space="preserve">): </w:t>
-            </w:r>
-            <w:r>
-              <w:rPr>
-                <w:rFonts w:ascii="Arial Narrow" w:hAnsi="Arial Narrow"/>
-                <w:b/>
-                <w:sz w:val="24"/>
-                <w:szCs w:val="24"/>
-              </w:rPr>
-              <w:t>PREFEITURA MUNICIPAL DE</w:t>
-            </w:r>
-            <w:r>
-              <w:rPr>
-                <w:rFonts w:ascii="Arial Narrow" w:hAnsi="Arial Narrow"/>
-                <w:b/>
-                <w:spacing w:val="1"/>
-                <w:sz w:val="24"/>
-                <w:szCs w:val="24"/>
-              </w:rPr>
-              <w:t xml:space="preserve"> </w:t>
-            </w:r>
-            <w:r>
-              <w:rPr>
-                <w:rFonts w:ascii="Arial Narrow" w:hAnsi="Arial Narrow"/>
-                <w:b/>
-                <w:sz w:val="24"/>
-                <w:szCs w:val="24"/>
-              </w:rPr>
-              <w:t>COREMAS,</w:t>
-            </w:r>
-            <w:r>
-              <w:rPr>
-                <w:rFonts w:ascii="Arial Narrow" w:hAnsi="Arial Narrow"/>
-                <w:b/>
-                <w:spacing w:val="1"/>
-                <w:sz w:val="24"/>
-                <w:szCs w:val="24"/>
-              </w:rPr>
-              <w:t xml:space="preserve"> </w:t>
-            </w:r>
-            <w:r>
-              <w:rPr>
-                <w:rFonts w:ascii="Arial Narrow" w:hAnsi="Arial Narrow"/>
-                <w:b/>
-                <w:sz w:val="24"/>
-                <w:szCs w:val="24"/>
-              </w:rPr>
-              <w:t>CNPJ:</w:t>
-            </w:r>
-            <w:r>
-              <w:rPr>
-                <w:rFonts w:ascii="Arial Narrow" w:hAnsi="Arial Narrow"/>
-                <w:b/>
-                <w:spacing w:val="1"/>
-                <w:sz w:val="24"/>
-                <w:szCs w:val="24"/>
-              </w:rPr>
-              <w:t xml:space="preserve"> </w:t>
-            </w:r>
-            <w:r>
-              <w:rPr>
-                <w:rFonts w:ascii="Arial Narrow" w:hAnsi="Arial Narrow"/>
-                <w:b/>
-                <w:sz w:val="24"/>
-                <w:szCs w:val="24"/>
-              </w:rPr>
-              <w:t>08.939.936/0001-94</w:t>
-            </w:r>
-            <w:r>
-              <w:rPr>
-                <w:rFonts w:ascii="Arial Narrow" w:hAnsi="Arial Narrow"/>
-                <w:b/>
-                <w:sz w:val="24"/>
-                <w:szCs w:val="24"/>
-              </w:rPr>
-              <w:t>.</w:t>
-            </w:r>
-          </w:p>
-          <w:p>
-            <w:pPr>
-              <w:pStyle w:val="TableParagraph"/>
-              <w:numPr>
-                <w:ilvl w:val="0"/>
-                <w:numId w:val="2"/>
-              </w:numPr>
-              <w:tabs>
-                <w:tab w:val="left" w:pos="748"/>
-              </w:tabs>
-              <w:spacing w:before="1"/>
-              <w:ind w:right="103"/>
-              <w:jc w:val="both"/>
-              <w:rPr>
-                <w:rFonts w:ascii="Arial Narrow" w:hAnsi="Arial Narrow" w:eastAsia="Courier New" w:cs="Courier New"/>
-                <w:b w:val="1"/>
-                <w:bCs w:val="1"/>
-                <w:noProof w:val="0"/>
-                <w:sz w:val="24"/>
-                <w:szCs w:val="24"/>
-                <w:lang w:val="pt-PT"/>
-              </w:rPr>
-            </w:pPr>
-            <w:r>
-              <w:rPr>
-                <w:rFonts w:ascii="Arial Narrow" w:hAnsi="Arial Narrow"/>
-                <w:sz w:val="24"/>
-                <w:szCs w:val="24"/>
-              </w:rPr>
-              <w:t xml:space="preserve">ART nº:  </w:t>
-            </w:r>
-            <w:r>
-              <w:rPr>
-                <w:rFonts w:ascii="Arial Narrow" w:hAnsi="Arial Narrow" w:eastAsia="Courier New" w:cs="Courier New"/>
-                <w:b w:val="1"/>
-                <w:bCs w:val="1"/>
-                <w:i w:val="0"/>
-                <w:iCs w:val="0"/>
-                <w:caps w:val="0"/>
-                <w:smallCaps w:val="0"/>
-                <w:noProof w:val="0"/>
-                <w:sz w:val="24"/>
-                <w:szCs w:val="24"/>
-                <w:lang w:val="pt-PT"/>
-              </w:rPr>
-              <w:t>PB20240641673</w:t>
-            </w:r>
-          </w:p>
-          <w:p>
-            <w:pPr>
-              <w:pStyle w:val="TableParagraph"/>
-              <w:numPr>
-                <w:ilvl w:val="0"/>
-                <w:numId w:val="2"/>
-              </w:numPr>
-              <w:tabs>
-                <w:tab w:val="left" w:pos="748"/>
-              </w:tabs>
-              <w:spacing w:before="1"/>
-              <w:jc w:val="both"/>
-              <w:rPr>
-                <w:rFonts w:ascii="Arial Narrow"/>
-                <w:b/>
-                <w:sz w:val="24"/>
-                <w:szCs w:val="24"/>
-              </w:rPr>
-            </w:pPr>
-            <w:r>
-              <w:rPr>
-                <w:rFonts w:ascii="Arial Narrow" w:hAnsi="Arial Narrow"/>
-                <w:sz w:val="24"/>
-                <w:szCs w:val="24"/>
-              </w:rPr>
-              <w:t>Responsável</w:t>
-            </w:r>
-            <w:r>
-              <w:rPr>
-                <w:rFonts w:ascii="Arial Narrow" w:hAnsi="Arial Narrow"/>
-                <w:spacing w:val="3"/>
-                <w:sz w:val="24"/>
-                <w:szCs w:val="24"/>
-              </w:rPr>
-              <w:t xml:space="preserve"> </w:t>
-            </w:r>
-            <w:r>
-              <w:rPr>
-                <w:rFonts w:ascii="Arial Narrow" w:hAnsi="Arial Narrow"/>
-                <w:sz w:val="24"/>
-                <w:szCs w:val="24"/>
-              </w:rPr>
-              <w:t>Técnico:</w:t>
-            </w:r>
-            <w:r>
-              <w:rPr>
-                <w:rFonts w:ascii="Arial Narrow" w:hAnsi="Arial Narrow"/>
-                <w:spacing w:val="3"/>
-                <w:sz w:val="24"/>
-                <w:szCs w:val="24"/>
-              </w:rPr>
-              <w:t xml:space="preserve"> </w:t>
-            </w:r>
-            <w:r>
-              <w:rPr>
-                <w:rFonts w:ascii="Arial Narrow" w:hAnsi="Arial Narrow"/>
-                <w:spacing w:val="3"/>
-                <w:sz w:val="24"/>
-                <w:szCs w:val="24"/>
-              </w:rPr>
-              <w:t xml:space="preserve">Engenheiro </w:t>
-            </w:r>
-            <w:r>
-              <w:rPr>
-                <w:rFonts w:ascii="Arial Narrow" w:hAnsi="Arial Narrow"/>
-                <w:spacing w:val="3"/>
-                <w:sz w:val="24"/>
-                <w:szCs w:val="24"/>
-              </w:rPr>
-              <w:t>civil</w:t>
-            </w:r>
-            <w:r>
-              <w:rPr>
-                <w:rFonts w:ascii="Arial Narrow" w:hAnsi="Arial Narrow"/>
-                <w:spacing w:val="3"/>
-                <w:sz w:val="24"/>
-                <w:szCs w:val="24"/>
-              </w:rPr>
-              <w:t xml:space="preserve"> </w:t>
-            </w:r>
-            <w:r>
-              <w:rPr>
-                <w:rFonts w:ascii="Arial Narrow" w:hAnsi="Arial Narrow"/>
-                <w:b/>
-                <w:spacing w:val="3"/>
-                <w:sz w:val="24"/>
-                <w:szCs w:val="24"/>
-              </w:rPr>
-              <w:t>Gustavo José Elias Batista Oliveira</w:t>
-            </w:r>
-            <w:r>
-              <w:rPr>
-                <w:rFonts w:ascii="Arial Narrow" w:hAnsi="Arial Narrow"/>
-                <w:spacing w:val="3"/>
-                <w:sz w:val="24"/>
-                <w:szCs w:val="24"/>
-              </w:rPr>
-              <w:t xml:space="preserve">, CREA-PB: </w:t>
-            </w:r>
-            <w:r>
-              <w:rPr>
-                <w:rFonts w:ascii="Arial Narrow" w:hAnsi="Arial Narrow"/>
-                <w:b/>
-                <w:bCs/>
-                <w:spacing w:val="3"/>
-                <w:sz w:val="24"/>
-                <w:szCs w:val="24"/>
-              </w:rPr>
-              <w:t>1614317240</w:t>
-            </w:r>
-            <w:r>
-              <w:rPr>
-                <w:rFonts w:ascii="Arial Narrow" w:hAnsi="Arial Narrow"/>
-                <w:spacing w:val="3"/>
-                <w:sz w:val="24"/>
-                <w:szCs w:val="24"/>
-              </w:rPr>
-              <w:t xml:space="preserve">, </w:t>
-            </w:r>
-          </w:p>
-          <w:p>
-            <w:pPr>
-              <w:pStyle w:val="TableParagraph"/>
-              <w:numPr>
-                <w:ilvl w:val="0"/>
-                <w:numId w:val="2"/>
-              </w:numPr>
-              <w:tabs>
-                <w:tab w:val="left" w:pos="748"/>
-              </w:tabs>
-              <w:rPr>
-                <w:rFonts w:ascii="Arial Narrow" w:hAnsi="Arial Narrow"/>
-                <w:sz w:val="24"/>
-                <w:szCs w:val="24"/>
-              </w:rPr>
-            </w:pPr>
-            <w:r>
-              <w:rPr>
-                <w:rFonts w:ascii="Arial Narrow" w:hAnsi="Arial Narrow"/>
-                <w:sz w:val="24"/>
-                <w:szCs w:val="24"/>
-              </w:rPr>
-              <w:t>Atividades</w:t>
-            </w:r>
-            <w:r>
-              <w:rPr>
-                <w:rFonts w:ascii="Arial Narrow" w:hAnsi="Arial Narrow"/>
-                <w:spacing w:val="-3"/>
-                <w:sz w:val="24"/>
-                <w:szCs w:val="24"/>
-              </w:rPr>
-              <w:t xml:space="preserve"> </w:t>
-            </w:r>
-            <w:r>
-              <w:rPr>
-                <w:rFonts w:ascii="Arial Narrow" w:hAnsi="Arial Narrow"/>
-                <w:sz w:val="24"/>
-                <w:szCs w:val="24"/>
-              </w:rPr>
-              <w:t>executadas</w:t>
-            </w:r>
-            <w:r>
-              <w:rPr>
-                <w:rFonts w:ascii="Arial Narrow" w:hAnsi="Arial Narrow"/>
-                <w:spacing w:val="-2"/>
-                <w:sz w:val="24"/>
-                <w:szCs w:val="24"/>
-              </w:rPr>
-              <w:t xml:space="preserve"> </w:t>
-            </w:r>
-            <w:r>
-              <w:rPr>
-                <w:rFonts w:ascii="Arial Narrow" w:hAnsi="Arial Narrow"/>
-                <w:sz w:val="24"/>
-                <w:szCs w:val="24"/>
-              </w:rPr>
-              <w:t>sob</w:t>
-            </w:r>
-            <w:r>
-              <w:rPr>
-                <w:rFonts w:ascii="Arial Narrow" w:hAnsi="Arial Narrow"/>
-                <w:spacing w:val="-5"/>
-                <w:sz w:val="24"/>
-                <w:szCs w:val="24"/>
-              </w:rPr>
-              <w:t xml:space="preserve"> </w:t>
-            </w:r>
-            <w:r>
-              <w:rPr>
-                <w:rFonts w:ascii="Arial Narrow" w:hAnsi="Arial Narrow"/>
-                <w:sz w:val="24"/>
-                <w:szCs w:val="24"/>
-              </w:rPr>
-              <w:t>a</w:t>
-            </w:r>
-            <w:r>
-              <w:rPr>
-                <w:rFonts w:ascii="Arial Narrow" w:hAnsi="Arial Narrow"/>
-                <w:spacing w:val="-5"/>
-                <w:sz w:val="24"/>
-                <w:szCs w:val="24"/>
-              </w:rPr>
-              <w:t xml:space="preserve"> </w:t>
-            </w:r>
-            <w:r>
-              <w:rPr>
-                <w:rFonts w:ascii="Arial Narrow" w:hAnsi="Arial Narrow"/>
-                <w:sz w:val="24"/>
-                <w:szCs w:val="24"/>
-              </w:rPr>
-              <w:t>sua</w:t>
-            </w:r>
-            <w:r>
-              <w:rPr>
-                <w:rFonts w:ascii="Arial Narrow" w:hAnsi="Arial Narrow"/>
-                <w:spacing w:val="-5"/>
-                <w:sz w:val="24"/>
-                <w:szCs w:val="24"/>
-              </w:rPr>
-              <w:t xml:space="preserve"> </w:t>
-            </w:r>
-            <w:r>
-              <w:rPr>
-                <w:rFonts w:ascii="Arial Narrow" w:hAnsi="Arial Narrow"/>
-                <w:sz w:val="24"/>
-                <w:szCs w:val="24"/>
-              </w:rPr>
-              <w:t>responsabilidade</w:t>
-            </w:r>
-            <w:r>
-              <w:rPr>
-                <w:rFonts w:ascii="Arial Narrow" w:hAnsi="Arial Narrow"/>
-                <w:spacing w:val="-1"/>
-                <w:sz w:val="24"/>
-                <w:szCs w:val="24"/>
-              </w:rPr>
-              <w:t xml:space="preserve"> </w:t>
-            </w:r>
-            <w:r>
-              <w:rPr>
-                <w:rFonts w:ascii="Arial Narrow" w:hAnsi="Arial Narrow"/>
-                <w:sz w:val="24"/>
-                <w:szCs w:val="24"/>
-              </w:rPr>
-              <w:t>técnica:</w:t>
             </w:r>
           </w:p>
           <w:p>
@@ -1613,8 +736,13 @@
               <w:tabs>
                 <w:tab w:val="left" w:pos="748"/>
               </w:tabs>
-              <w:rPr>
-                <w:rFonts w:ascii="Arial Narrow" w:hAnsi="Arial Narrow"/>
+              <w:spacing w:before="7" w:line="237" w:lineRule="auto"/>
+              <w:ind w:right="106"/>
+              <w:jc w:val="both"/>
+              <w:rPr>
+                <w:rFonts w:ascii="Arial Narrow" w:hAnsi="Arial Narrow"/>
+                <w:b/>
+                <w:bCs/>
                 <w:sz w:val="24"/>
                 <w:szCs w:val="24"/>
               </w:rPr>
@@ -1625,7 +753,25 @@
                 <w:sz w:val="24"/>
                 <w:szCs w:val="24"/>
               </w:rPr>
-              <w:t>Elaboração de Projeto, orçamento e especificações</w:t>
+              <w:t>Objeto do contrato:</w:t>
+            </w:r>
+            <w:r>
+              <w:rPr>
+                <w:rFonts w:ascii="Arial Narrow" w:hAnsi="Arial Narrow"/>
+                <w:sz w:val="24"/>
+                <w:szCs w:val="24"/>
+              </w:rPr>
+              <w:t xml:space="preserve"> </w:t>
+            </w:r>
+            <w:r>
+              <w:rPr>
+                <w:rFonts w:ascii="Arial Narrow" w:hAnsi="Arial Narrow"/>
+                <w:b/>
+                <w:bCs/>
+                <w:sz w:val="24"/>
+                <w:szCs w:val="24"/>
+              </w:rPr>
+              <w:t>Elaboração de Projeto, orçamento e especificações do CEASM - CENTRO ESPECIALIZADO DE ATENÇÃO À SAÚDE MENTAL com área de 467,04 m² para a cidade de Coremas – PB.</w:t>
             </w:r>
           </w:p>
           <w:p>
@@ -1633,7 +779,1054 @@
               <w:pStyle w:val="TableParagraph"/>
               <w:numPr>
                 <w:ilvl w:val="0"/>
-                <w:numId w:val="2"/>
+                <w:numId w:val="4"/>
+              </w:numPr>
+              <w:tabs>
+                <w:tab w:val="left" w:pos="748"/>
+              </w:tabs>
+              <w:spacing w:before="3"/>
+              <w:jc w:val="both"/>
+              <w:rPr>
+                <w:rFonts w:ascii="Arial Narrow" w:hAnsi="Arial Narrow"/>
+                <w:b/>
+                <w:bCs/>
+                <w:sz w:val="24"/>
+                <w:szCs w:val="24"/>
+              </w:rPr>
+            </w:pPr>
+            <w:r>
+              <w:rPr>
+                <w:rFonts w:ascii="Arial Narrow" w:hAnsi="Arial Narrow"/>
+                <w:sz w:val="24"/>
+                <w:szCs w:val="24"/>
+              </w:rPr>
+              <w:t>Endereço</w:t>
+            </w:r>
+            <w:r>
+              <w:rPr>
+                <w:rFonts w:ascii="Arial Narrow" w:hAnsi="Arial Narrow"/>
+                <w:spacing w:val="-1"/>
+                <w:sz w:val="24"/>
+                <w:szCs w:val="24"/>
+              </w:rPr>
+              <w:t xml:space="preserve"> </w:t>
+            </w:r>
+            <w:r>
+              <w:rPr>
+                <w:rFonts w:ascii="Arial Narrow" w:hAnsi="Arial Narrow"/>
+                <w:sz w:val="24"/>
+                <w:szCs w:val="24"/>
+              </w:rPr>
+              <w:t>da</w:t>
+            </w:r>
+            <w:r>
+              <w:rPr>
+                <w:rFonts w:ascii="Arial Narrow" w:hAnsi="Arial Narrow"/>
+                <w:sz w:val="24"/>
+                <w:szCs w:val="24"/>
+              </w:rPr>
+              <w:t>(</w:t>
+            </w:r>
+            <w:r>
+              <w:rPr>
+                <w:rFonts w:ascii="Arial Narrow" w:hAnsi="Arial Narrow"/>
+                <w:sz w:val="24"/>
+                <w:szCs w:val="24"/>
+              </w:rPr>
+              <w:t>s</w:t>
+            </w:r>
+            <w:r>
+              <w:rPr>
+                <w:rFonts w:ascii="Arial Narrow" w:hAnsi="Arial Narrow"/>
+                <w:sz w:val="24"/>
+                <w:szCs w:val="24"/>
+              </w:rPr>
+              <w:t>)</w:t>
+            </w:r>
+            <w:r>
+              <w:rPr>
+                <w:rFonts w:ascii="Arial Narrow" w:hAnsi="Arial Narrow"/>
+                <w:spacing w:val="4"/>
+                <w:sz w:val="24"/>
+                <w:szCs w:val="24"/>
+              </w:rPr>
+              <w:t xml:space="preserve"> </w:t>
+            </w:r>
+            <w:r>
+              <w:rPr>
+                <w:rFonts w:ascii="Arial Narrow" w:hAnsi="Arial Narrow"/>
+                <w:i/>
+                <w:iCs/>
+                <w:sz w:val="24"/>
+                <w:szCs w:val="24"/>
+                <w:u w:val="thick"/>
+              </w:rPr>
+              <w:t>obra</w:t>
+            </w:r>
+            <w:r>
+              <w:rPr>
+                <w:rFonts w:ascii="Arial Narrow" w:hAnsi="Arial Narrow"/>
+                <w:i/>
+                <w:iCs/>
+                <w:sz w:val="24"/>
+                <w:szCs w:val="24"/>
+                <w:u w:val="thick"/>
+              </w:rPr>
+              <w:t>(</w:t>
+            </w:r>
+            <w:r>
+              <w:rPr>
+                <w:rFonts w:ascii="Arial Narrow" w:hAnsi="Arial Narrow"/>
+                <w:i/>
+                <w:iCs/>
+                <w:sz w:val="24"/>
+                <w:szCs w:val="24"/>
+                <w:u w:val="thick"/>
+              </w:rPr>
+              <w:t>s</w:t>
+            </w:r>
+            <w:r>
+              <w:rPr>
+                <w:rFonts w:ascii="Arial Narrow" w:hAnsi="Arial Narrow"/>
+                <w:i/>
+                <w:iCs/>
+                <w:sz w:val="24"/>
+                <w:szCs w:val="24"/>
+                <w:u w:val="thick"/>
+              </w:rPr>
+              <w:t>)</w:t>
+            </w:r>
+            <w:r>
+              <w:rPr>
+                <w:rFonts w:ascii="Arial Narrow" w:hAnsi="Arial Narrow"/>
+                <w:i/>
+                <w:iCs/>
+                <w:spacing w:val="-1"/>
+                <w:sz w:val="24"/>
+                <w:szCs w:val="24"/>
+                <w:u w:val="thick"/>
+              </w:rPr>
+              <w:t xml:space="preserve"> </w:t>
+            </w:r>
+            <w:r>
+              <w:rPr>
+                <w:rFonts w:ascii="Arial Narrow" w:hAnsi="Arial Narrow"/>
+                <w:i/>
+                <w:iCs/>
+                <w:sz w:val="24"/>
+                <w:szCs w:val="24"/>
+                <w:u w:val="thick"/>
+              </w:rPr>
+              <w:t>ou</w:t>
+            </w:r>
+            <w:r>
+              <w:rPr>
+                <w:rFonts w:ascii="Arial Narrow" w:hAnsi="Arial Narrow"/>
+                <w:i/>
+                <w:iCs/>
+                <w:spacing w:val="-1"/>
+                <w:sz w:val="24"/>
+                <w:szCs w:val="24"/>
+                <w:u w:val="thick"/>
+              </w:rPr>
+              <w:t xml:space="preserve"> </w:t>
+            </w:r>
+            <w:r>
+              <w:rPr>
+                <w:rFonts w:ascii="Arial Narrow" w:hAnsi="Arial Narrow"/>
+                <w:i/>
+                <w:iCs/>
+                <w:sz w:val="24"/>
+                <w:szCs w:val="24"/>
+                <w:u w:val="thick"/>
+              </w:rPr>
+              <w:t>serviço</w:t>
+            </w:r>
+            <w:r>
+              <w:rPr>
+                <w:rFonts w:ascii="Arial Narrow" w:hAnsi="Arial Narrow"/>
+                <w:i/>
+                <w:iCs/>
+                <w:spacing w:val="-1"/>
+                <w:sz w:val="24"/>
+                <w:szCs w:val="24"/>
+                <w:u w:val="thick"/>
+              </w:rPr>
+              <w:t xml:space="preserve"> </w:t>
+            </w:r>
+            <w:r>
+              <w:rPr>
+                <w:rFonts w:ascii="Arial Narrow" w:hAnsi="Arial Narrow"/>
+                <w:i/>
+                <w:iCs/>
+                <w:sz w:val="24"/>
+                <w:szCs w:val="24"/>
+                <w:u w:val="thick"/>
+              </w:rPr>
+              <w:t>técnico</w:t>
+            </w:r>
+            <w:r>
+              <w:rPr>
+                <w:rFonts w:ascii="Arial Narrow" w:hAnsi="Arial Narrow"/>
+                <w:sz w:val="24"/>
+                <w:szCs w:val="24"/>
+              </w:rPr>
+              <w:t>:</w:t>
+            </w:r>
+            <w:bookmarkStart w:id="0" w:name="_Hlk201050284"/>
+            <w:r>
+              <w:rPr>
+                <w:rFonts w:ascii="Arial Narrow" w:hAnsi="Arial Narrow"/>
+                <w:b/>
+                <w:bCs/>
+                <w:spacing w:val="2"/>
+                <w:sz w:val="24"/>
+                <w:szCs w:val="24"/>
+              </w:rPr>
+              <w:t xml:space="preserve"> </w:t>
+            </w:r>
+            <w:r>
+              <w:rPr>
+                <w:rFonts w:ascii="Arial Narrow" w:hAnsi="Arial Narrow"/>
+                <w:b/>
+                <w:bCs/>
+                <w:sz w:val="24"/>
+                <w:szCs w:val="24"/>
+              </w:rPr>
+              <w:t>Rua Maria Farias de Assis</w:t>
+            </w:r>
+            <w:r>
+              <w:rPr>
+                <w:rFonts w:ascii="Arial Narrow" w:hAnsi="Arial Narrow"/>
+                <w:b/>
+                <w:bCs/>
+                <w:sz w:val="24"/>
+                <w:szCs w:val="24"/>
+              </w:rPr>
+              <w:t>, Estação da Luz</w:t>
+            </w:r>
+          </w:p>
+          <w:bookmarkEnd w:id="0"/>
+          <w:p>
+            <w:pPr>
+              <w:pStyle w:val="TableParagraph"/>
+              <w:numPr>
+                <w:ilvl w:val="0"/>
+                <w:numId w:val="4"/>
+              </w:numPr>
+              <w:tabs>
+                <w:tab w:val="left" w:pos="748"/>
+              </w:tabs>
+              <w:spacing w:before="1"/>
+              <w:ind w:right="103"/>
+              <w:jc w:val="both"/>
+              <w:rPr>
+                <w:rFonts w:ascii="Arial Narrow" w:hAnsi="Arial Narrow"/>
+                <w:b/>
+                <w:sz w:val="24"/>
+                <w:szCs w:val="24"/>
+              </w:rPr>
+            </w:pPr>
+            <w:r>
+              <w:rPr>
+                <w:rFonts w:ascii="Arial Narrow" w:hAnsi="Arial Narrow"/>
+                <w:sz w:val="24"/>
+                <w:szCs w:val="24"/>
+              </w:rPr>
+              <w:t>Empresa</w:t>
+            </w:r>
+            <w:r>
+              <w:rPr>
+                <w:rFonts w:ascii="Arial Narrow" w:hAnsi="Arial Narrow"/>
+                <w:spacing w:val="1"/>
+                <w:sz w:val="24"/>
+                <w:szCs w:val="24"/>
+              </w:rPr>
+              <w:t xml:space="preserve"> </w:t>
+            </w:r>
+            <w:r>
+              <w:rPr>
+                <w:rFonts w:ascii="Arial Narrow" w:hAnsi="Arial Narrow"/>
+                <w:sz w:val="24"/>
+                <w:szCs w:val="24"/>
+              </w:rPr>
+              <w:t xml:space="preserve">contratada: </w:t>
+            </w:r>
+            <w:r>
+              <w:rPr>
+                <w:rFonts w:ascii="Arial Narrow" w:hAnsi="Arial Narrow"/>
+                <w:b/>
+                <w:sz w:val="24"/>
+                <w:szCs w:val="24"/>
+              </w:rPr>
+              <w:t>Gustavo José Elias Batista Oliveira-ME</w:t>
+            </w:r>
+            <w:r>
+              <w:rPr>
+                <w:rFonts w:ascii="Arial Narrow" w:hAnsi="Arial Narrow"/>
+                <w:b/>
+                <w:sz w:val="24"/>
+                <w:szCs w:val="24"/>
+              </w:rPr>
+              <w:t xml:space="preserve"> CNPJ: </w:t>
+            </w:r>
+            <w:r>
+              <w:rPr>
+                <w:rFonts w:ascii="Arial Narrow" w:hAnsi="Arial Narrow"/>
+                <w:b/>
+                <w:sz w:val="24"/>
+                <w:szCs w:val="24"/>
+              </w:rPr>
+              <w:t>27</w:t>
+            </w:r>
+            <w:r>
+              <w:rPr>
+                <w:rFonts w:ascii="Arial Narrow" w:hAnsi="Arial Narrow"/>
+                <w:b/>
+                <w:sz w:val="24"/>
+                <w:szCs w:val="24"/>
+              </w:rPr>
+              <w:t>.</w:t>
+            </w:r>
+            <w:r>
+              <w:rPr>
+                <w:rFonts w:ascii="Arial Narrow" w:hAnsi="Arial Narrow"/>
+                <w:b/>
+                <w:sz w:val="24"/>
+                <w:szCs w:val="24"/>
+              </w:rPr>
+              <w:t>555</w:t>
+            </w:r>
+            <w:r>
+              <w:rPr>
+                <w:rFonts w:ascii="Arial Narrow" w:hAnsi="Arial Narrow"/>
+                <w:b/>
+                <w:sz w:val="24"/>
+                <w:szCs w:val="24"/>
+              </w:rPr>
+              <w:t>.</w:t>
+            </w:r>
+            <w:r>
+              <w:rPr>
+                <w:rFonts w:ascii="Arial Narrow" w:hAnsi="Arial Narrow"/>
+                <w:b/>
+                <w:sz w:val="24"/>
+                <w:szCs w:val="24"/>
+              </w:rPr>
+              <w:t>3</w:t>
+            </w:r>
+            <w:r>
+              <w:rPr>
+                <w:rFonts w:ascii="Arial Narrow" w:hAnsi="Arial Narrow"/>
+                <w:b/>
+                <w:sz w:val="24"/>
+                <w:szCs w:val="24"/>
+              </w:rPr>
+              <w:t>8</w:t>
+            </w:r>
+            <w:r>
+              <w:rPr>
+                <w:rFonts w:ascii="Arial Narrow" w:hAnsi="Arial Narrow"/>
+                <w:b/>
+                <w:sz w:val="24"/>
+                <w:szCs w:val="24"/>
+              </w:rPr>
+              <w:t>9</w:t>
+            </w:r>
+            <w:r>
+              <w:rPr>
+                <w:rFonts w:ascii="Arial Narrow" w:hAnsi="Arial Narrow"/>
+                <w:b/>
+                <w:sz w:val="24"/>
+                <w:szCs w:val="24"/>
+              </w:rPr>
+              <w:t>/0001-</w:t>
+            </w:r>
+            <w:r>
+              <w:rPr>
+                <w:rFonts w:ascii="Arial Narrow" w:hAnsi="Arial Narrow"/>
+                <w:b/>
+                <w:sz w:val="24"/>
+                <w:szCs w:val="24"/>
+              </w:rPr>
+              <w:t>98</w:t>
+            </w:r>
+            <w:r>
+              <w:rPr>
+                <w:rFonts w:ascii="Arial Narrow" w:hAnsi="Arial Narrow"/>
+                <w:b/>
+                <w:sz w:val="24"/>
+                <w:szCs w:val="24"/>
+              </w:rPr>
+              <w:t>.</w:t>
+            </w:r>
+          </w:p>
+          <w:p>
+            <w:pPr>
+              <w:pStyle w:val="TableParagraph"/>
+              <w:numPr>
+                <w:ilvl w:val="0"/>
+                <w:numId w:val="4"/>
+              </w:numPr>
+              <w:tabs>
+                <w:tab w:val="left" w:pos="748"/>
+              </w:tabs>
+              <w:spacing w:before="1"/>
+              <w:ind w:right="103"/>
+              <w:jc w:val="both"/>
+              <w:rPr>
+                <w:rFonts w:ascii="Arial Narrow" w:hAnsi="Arial Narrow"/>
+                <w:b/>
+                <w:sz w:val="24"/>
+                <w:szCs w:val="24"/>
+              </w:rPr>
+            </w:pPr>
+            <w:r>
+              <w:rPr>
+                <w:rFonts w:ascii="Arial Narrow" w:hAnsi="Arial Narrow"/>
+                <w:sz w:val="24"/>
+                <w:szCs w:val="24"/>
+              </w:rPr>
+              <w:t>Contratante e Proprietário da (</w:t>
+            </w:r>
+            <w:r>
+              <w:rPr>
+                <w:rFonts w:ascii="Arial Narrow" w:hAnsi="Arial Narrow"/>
+                <w:i/>
+                <w:sz w:val="24"/>
+                <w:szCs w:val="24"/>
+                <w:u w:val="thick"/>
+              </w:rPr>
+              <w:t>obra ou serviço técnico</w:t>
+            </w:r>
+            <w:r>
+              <w:rPr>
+                <w:rFonts w:ascii="Arial Narrow" w:hAnsi="Arial Narrow"/>
+                <w:sz w:val="24"/>
+                <w:szCs w:val="24"/>
+              </w:rPr>
+              <w:t xml:space="preserve">): </w:t>
+            </w:r>
+            <w:r>
+              <w:rPr>
+                <w:rFonts w:ascii="Arial Narrow" w:hAnsi="Arial Narrow"/>
+                <w:b/>
+                <w:sz w:val="24"/>
+                <w:szCs w:val="24"/>
+              </w:rPr>
+              <w:t>PREFEITURA MUNICIPAL DE</w:t>
+            </w:r>
+            <w:r>
+              <w:rPr>
+                <w:rFonts w:ascii="Arial Narrow" w:hAnsi="Arial Narrow"/>
+                <w:b/>
+                <w:spacing w:val="1"/>
+                <w:sz w:val="24"/>
+                <w:szCs w:val="24"/>
+              </w:rPr>
+              <w:t xml:space="preserve"> </w:t>
+            </w:r>
+            <w:r>
+              <w:rPr>
+                <w:rFonts w:ascii="Arial Narrow" w:hAnsi="Arial Narrow"/>
+                <w:b/>
+                <w:sz w:val="24"/>
+                <w:szCs w:val="24"/>
+              </w:rPr>
+              <w:t>COREMAS,</w:t>
+            </w:r>
+            <w:r>
+              <w:rPr>
+                <w:rFonts w:ascii="Arial Narrow" w:hAnsi="Arial Narrow"/>
+                <w:b/>
+                <w:spacing w:val="1"/>
+                <w:sz w:val="24"/>
+                <w:szCs w:val="24"/>
+              </w:rPr>
+              <w:t xml:space="preserve"> </w:t>
+            </w:r>
+            <w:r>
+              <w:rPr>
+                <w:rFonts w:ascii="Arial Narrow" w:hAnsi="Arial Narrow"/>
+                <w:b/>
+                <w:sz w:val="24"/>
+                <w:szCs w:val="24"/>
+              </w:rPr>
+              <w:t>CNPJ:</w:t>
+            </w:r>
+            <w:r>
+              <w:rPr>
+                <w:rFonts w:ascii="Arial Narrow" w:hAnsi="Arial Narrow"/>
+                <w:b/>
+                <w:spacing w:val="1"/>
+                <w:sz w:val="24"/>
+                <w:szCs w:val="24"/>
+              </w:rPr>
+              <w:t xml:space="preserve"> </w:t>
+            </w:r>
+            <w:r>
+              <w:rPr>
+                <w:rFonts w:ascii="Arial Narrow" w:hAnsi="Arial Narrow"/>
+                <w:b/>
+                <w:sz w:val="24"/>
+                <w:szCs w:val="24"/>
+              </w:rPr>
+              <w:t>08.939.936/0001-94</w:t>
+            </w:r>
+            <w:r>
+              <w:rPr>
+                <w:rFonts w:ascii="Arial Narrow" w:hAnsi="Arial Narrow"/>
+                <w:b/>
+                <w:sz w:val="24"/>
+                <w:szCs w:val="24"/>
+              </w:rPr>
+              <w:t>.</w:t>
+            </w:r>
+          </w:p>
+          <w:p>
+            <w:pPr>
+              <w:pStyle w:val="TableParagraph"/>
+              <w:numPr>
+                <w:ilvl w:val="0"/>
+                <w:numId w:val="4"/>
+              </w:numPr>
+              <w:tabs>
+                <w:tab w:val="left" w:pos="748"/>
+              </w:tabs>
+              <w:spacing w:before="1"/>
+              <w:ind w:right="103"/>
+              <w:jc w:val="both"/>
+              <w:rPr>
+                <w:rFonts w:ascii="Arial Narrow" w:hAnsi="Arial Narrow"/>
+                <w:b/>
+                <w:bCs/>
+                <w:sz w:val="24"/>
+                <w:szCs w:val="24"/>
+              </w:rPr>
+            </w:pPr>
+            <w:r>
+              <w:rPr>
+                <w:rFonts w:ascii="Arial Narrow" w:hAnsi="Arial Narrow"/>
+                <w:sz w:val="24"/>
+                <w:szCs w:val="24"/>
+              </w:rPr>
+              <w:t xml:space="preserve">ART nº:  </w:t>
+            </w:r>
+            <w:r>
+              <w:rPr>
+                <w:rFonts w:ascii="Arial Narrow" w:hAnsi="Arial Narrow"/>
+                <w:b/>
+                <w:bCs/>
+                <w:sz w:val="24"/>
+                <w:szCs w:val="24"/>
+              </w:rPr>
+              <w:t>PB20240641673</w:t>
+            </w:r>
+          </w:p>
+          <w:p>
+            <w:pPr>
+              <w:pStyle w:val="TableParagraph"/>
+              <w:numPr>
+                <w:ilvl w:val="0"/>
+                <w:numId w:val="4"/>
+              </w:numPr>
+              <w:tabs>
+                <w:tab w:val="left" w:pos="748"/>
+              </w:tabs>
+              <w:spacing w:before="1"/>
+              <w:jc w:val="both"/>
+              <w:rPr>
+                <w:rFonts w:ascii="Arial Narrow"/>
+                <w:b/>
+                <w:sz w:val="24"/>
+                <w:szCs w:val="24"/>
+              </w:rPr>
+            </w:pPr>
+            <w:r>
+              <w:rPr>
+                <w:rFonts w:ascii="Arial Narrow" w:hAnsi="Arial Narrow"/>
+                <w:sz w:val="24"/>
+                <w:szCs w:val="24"/>
+              </w:rPr>
+              <w:t>Responsável</w:t>
+            </w:r>
+            <w:r>
+              <w:rPr>
+                <w:rFonts w:ascii="Arial Narrow" w:hAnsi="Arial Narrow"/>
+                <w:spacing w:val="3"/>
+                <w:sz w:val="24"/>
+                <w:szCs w:val="24"/>
+              </w:rPr>
+              <w:t xml:space="preserve"> </w:t>
+            </w:r>
+            <w:r>
+              <w:rPr>
+                <w:rFonts w:ascii="Arial Narrow" w:hAnsi="Arial Narrow"/>
+                <w:sz w:val="24"/>
+                <w:szCs w:val="24"/>
+              </w:rPr>
+              <w:t>Técnico:</w:t>
+            </w:r>
+            <w:r>
+              <w:rPr>
+                <w:rFonts w:ascii="Arial Narrow" w:hAnsi="Arial Narrow"/>
+                <w:spacing w:val="3"/>
+                <w:sz w:val="24"/>
+                <w:szCs w:val="24"/>
+              </w:rPr>
+              <w:t xml:space="preserve"> </w:t>
+            </w:r>
+            <w:r>
+              <w:rPr>
+                <w:rFonts w:ascii="Arial Narrow" w:hAnsi="Arial Narrow"/>
+                <w:spacing w:val="3"/>
+                <w:sz w:val="24"/>
+                <w:szCs w:val="24"/>
+              </w:rPr>
+              <w:t xml:space="preserve">Engenheiro </w:t>
+            </w:r>
+            <w:r>
+              <w:rPr>
+                <w:rFonts w:ascii="Arial Narrow" w:hAnsi="Arial Narrow"/>
+                <w:spacing w:val="3"/>
+                <w:sz w:val="24"/>
+                <w:szCs w:val="24"/>
+              </w:rPr>
+              <w:t>civil</w:t>
+            </w:r>
+            <w:r>
+              <w:rPr>
+                <w:rFonts w:ascii="Arial Narrow" w:hAnsi="Arial Narrow"/>
+                <w:spacing w:val="3"/>
+                <w:sz w:val="24"/>
+                <w:szCs w:val="24"/>
+              </w:rPr>
+              <w:t xml:space="preserve"> </w:t>
+            </w:r>
+            <w:r>
+              <w:rPr>
+                <w:rFonts w:ascii="Arial Narrow" w:hAnsi="Arial Narrow"/>
+                <w:b/>
+                <w:spacing w:val="3"/>
+                <w:sz w:val="24"/>
+                <w:szCs w:val="24"/>
+              </w:rPr>
+              <w:t>Gustavo José Elias Batista Oliveira</w:t>
+            </w:r>
+            <w:r>
+              <w:rPr>
+                <w:rFonts w:ascii="Arial Narrow" w:hAnsi="Arial Narrow"/>
+                <w:spacing w:val="3"/>
+                <w:sz w:val="24"/>
+                <w:szCs w:val="24"/>
+              </w:rPr>
+              <w:t xml:space="preserve">, CREA-PB: </w:t>
+            </w:r>
+            <w:r>
+              <w:rPr>
+                <w:rFonts w:ascii="Arial Narrow" w:hAnsi="Arial Narrow"/>
+                <w:b/>
+                <w:bCs/>
+                <w:spacing w:val="3"/>
+                <w:sz w:val="24"/>
+                <w:szCs w:val="24"/>
+              </w:rPr>
+              <w:t>1614317240</w:t>
+            </w:r>
+            <w:r>
+              <w:rPr>
+                <w:rFonts w:ascii="Arial Narrow" w:hAnsi="Arial Narrow"/>
+                <w:spacing w:val="3"/>
+                <w:sz w:val="24"/>
+                <w:szCs w:val="24"/>
+              </w:rPr>
+              <w:t xml:space="preserve">, </w:t>
+            </w:r>
+          </w:p>
+          <w:p>
+            <w:pPr>
+              <w:pStyle w:val="TableParagraph"/>
+              <w:numPr>
+                <w:ilvl w:val="0"/>
+                <w:numId w:val="4"/>
+              </w:numPr>
+              <w:tabs>
+                <w:tab w:val="left" w:pos="748"/>
+              </w:tabs>
+              <w:rPr>
+                <w:rFonts w:ascii="Arial Narrow" w:hAnsi="Arial Narrow"/>
+                <w:sz w:val="24"/>
+                <w:szCs w:val="24"/>
+              </w:rPr>
+            </w:pPr>
+            <w:r>
+              <w:rPr>
+                <w:rFonts w:ascii="Arial Narrow" w:hAnsi="Arial Narrow"/>
+                <w:sz w:val="24"/>
+                <w:szCs w:val="24"/>
+              </w:rPr>
+              <w:t>Atividades</w:t>
+            </w:r>
+            <w:r>
+              <w:rPr>
+                <w:rFonts w:ascii="Arial Narrow" w:hAnsi="Arial Narrow"/>
+                <w:spacing w:val="-3"/>
+                <w:sz w:val="24"/>
+                <w:szCs w:val="24"/>
+              </w:rPr>
+              <w:t xml:space="preserve"> </w:t>
+            </w:r>
+            <w:r>
+              <w:rPr>
+                <w:rFonts w:ascii="Arial Narrow" w:hAnsi="Arial Narrow"/>
+                <w:sz w:val="24"/>
+                <w:szCs w:val="24"/>
+              </w:rPr>
+              <w:t>executadas</w:t>
+            </w:r>
+            <w:r>
+              <w:rPr>
+                <w:rFonts w:ascii="Arial Narrow" w:hAnsi="Arial Narrow"/>
+                <w:spacing w:val="-2"/>
+                <w:sz w:val="24"/>
+                <w:szCs w:val="24"/>
+              </w:rPr>
+              <w:t xml:space="preserve"> </w:t>
+            </w:r>
+            <w:r>
+              <w:rPr>
+                <w:rFonts w:ascii="Arial Narrow" w:hAnsi="Arial Narrow"/>
+                <w:sz w:val="24"/>
+                <w:szCs w:val="24"/>
+              </w:rPr>
+              <w:t>sob</w:t>
+            </w:r>
+            <w:r>
+              <w:rPr>
+                <w:rFonts w:ascii="Arial Narrow" w:hAnsi="Arial Narrow"/>
+                <w:spacing w:val="-5"/>
+                <w:sz w:val="24"/>
+                <w:szCs w:val="24"/>
+              </w:rPr>
+              <w:t xml:space="preserve"> </w:t>
+            </w:r>
+            <w:r>
+              <w:rPr>
+                <w:rFonts w:ascii="Arial Narrow" w:hAnsi="Arial Narrow"/>
+                <w:sz w:val="24"/>
+                <w:szCs w:val="24"/>
+              </w:rPr>
+              <w:t>a</w:t>
+            </w:r>
+            <w:r>
+              <w:rPr>
+                <w:rFonts w:ascii="Arial Narrow" w:hAnsi="Arial Narrow"/>
+                <w:spacing w:val="-5"/>
+                <w:sz w:val="24"/>
+                <w:szCs w:val="24"/>
+              </w:rPr>
+              <w:t xml:space="preserve"> </w:t>
+            </w:r>
+            <w:r>
+              <w:rPr>
+                <w:rFonts w:ascii="Arial Narrow" w:hAnsi="Arial Narrow"/>
+                <w:sz w:val="24"/>
+                <w:szCs w:val="24"/>
+              </w:rPr>
+              <w:t>sua</w:t>
+            </w:r>
+            <w:r>
+              <w:rPr>
+                <w:rFonts w:ascii="Arial Narrow" w:hAnsi="Arial Narrow"/>
+                <w:spacing w:val="-5"/>
+                <w:sz w:val="24"/>
+                <w:szCs w:val="24"/>
+              </w:rPr>
+              <w:t xml:space="preserve"> </w:t>
+            </w:r>
+            <w:r>
+              <w:rPr>
+                <w:rFonts w:ascii="Arial Narrow" w:hAnsi="Arial Narrow"/>
+                <w:sz w:val="24"/>
+                <w:szCs w:val="24"/>
+              </w:rPr>
+              <w:t>responsabilidade</w:t>
+            </w:r>
+            <w:r>
+              <w:rPr>
+                <w:rFonts w:ascii="Arial Narrow" w:hAnsi="Arial Narrow"/>
+                <w:spacing w:val="-1"/>
+                <w:sz w:val="24"/>
+                <w:szCs w:val="24"/>
+              </w:rPr>
+              <w:t xml:space="preserve"> </w:t>
+            </w:r>
+            <w:r>
+              <w:rPr>
+                <w:rFonts w:ascii="Arial Narrow" w:hAnsi="Arial Narrow"/>
+                <w:sz w:val="24"/>
+                <w:szCs w:val="24"/>
+              </w:rPr>
+              <w:t>técnica:</w:t>
+            </w:r>
+          </w:p>
+          <w:p>
+            <w:pPr>
+              <w:pStyle w:val="TableParagraph"/>
+              <w:numPr>
+                <w:ilvl w:val="0"/>
+                <w:numId w:val="6"/>
+              </w:numPr>
+              <w:tabs>
+                <w:tab w:val="left" w:pos="748"/>
+              </w:tabs>
+              <w:rPr>
+                <w:rFonts w:ascii="Arial Narrow" w:hAnsi="Arial Narrow"/>
+                <w:sz w:val="24"/>
+                <w:szCs w:val="24"/>
+              </w:rPr>
+            </w:pPr>
+            <w:r>
+              <w:rPr>
+                <w:rFonts w:ascii="Arial Narrow" w:hAnsi="Arial Narrow"/>
+                <w:sz w:val="24"/>
+                <w:szCs w:val="24"/>
+              </w:rPr>
+              <w:t xml:space="preserve">Elaboração de </w:t>
+            </w:r>
+            <w:r>
+              <w:rPr>
+                <w:rFonts w:ascii="Arial Narrow" w:hAnsi="Arial Narrow"/>
+                <w:sz w:val="24"/>
+                <w:szCs w:val="24"/>
+              </w:rPr>
+              <w:t>p</w:t>
+            </w:r>
+            <w:r>
+              <w:rPr>
+                <w:rFonts w:ascii="Arial Narrow" w:hAnsi="Arial Narrow"/>
+                <w:sz w:val="24"/>
+                <w:szCs w:val="24"/>
+              </w:rPr>
+              <w:t>rojeto</w:t>
+            </w:r>
+            <w:r>
+              <w:rPr>
+                <w:rFonts w:ascii="Arial Narrow" w:hAnsi="Arial Narrow"/>
+                <w:sz w:val="24"/>
+                <w:szCs w:val="24"/>
+              </w:rPr>
+              <w:t xml:space="preserve">s: </w:t>
+            </w:r>
+            <w:r>
+              <w:rPr>
+                <w:rFonts w:ascii="Arial Narrow" w:hAnsi="Arial Narrow"/>
+                <w:sz w:val="24"/>
+                <w:szCs w:val="24"/>
+              </w:rPr>
+              <w:t>Estrutural, el</w:t>
+            </w:r>
+            <w:r>
+              <w:rPr>
+                <w:rFonts w:ascii="Arial Narrow" w:hAnsi="Arial Narrow"/>
+                <w:sz w:val="24"/>
+                <w:szCs w:val="24"/>
+              </w:rPr>
+              <w:t>é</w:t>
+            </w:r>
+            <w:r>
+              <w:rPr>
+                <w:rFonts w:ascii="Arial Narrow" w:hAnsi="Arial Narrow"/>
+                <w:sz w:val="24"/>
+                <w:szCs w:val="24"/>
+              </w:rPr>
+              <w:t xml:space="preserve">trico e </w:t>
+            </w:r>
+            <w:r>
+              <w:rPr>
+                <w:rFonts w:ascii="Arial Narrow" w:hAnsi="Arial Narrow"/>
+                <w:sz w:val="24"/>
+                <w:szCs w:val="24"/>
+              </w:rPr>
+              <w:t>hidrossanitário</w:t>
+            </w:r>
+            <w:r>
+              <w:rPr>
+                <w:rFonts w:ascii="Arial Narrow" w:hAnsi="Arial Narrow"/>
+                <w:sz w:val="24"/>
+                <w:szCs w:val="24"/>
+              </w:rPr>
+              <w:t>;</w:t>
+            </w:r>
+          </w:p>
+          <w:p>
+            <w:pPr>
+              <w:pStyle w:val="TableParagraph"/>
+              <w:numPr>
+                <w:ilvl w:val="0"/>
+                <w:numId w:val="6"/>
+              </w:numPr>
+              <w:tabs>
+                <w:tab w:val="left" w:pos="748"/>
+              </w:tabs>
+              <w:rPr>
+                <w:rFonts w:ascii="Arial Narrow" w:hAnsi="Arial Narrow"/>
+                <w:sz w:val="24"/>
+                <w:szCs w:val="24"/>
+              </w:rPr>
+            </w:pPr>
+            <w:r>
+              <w:rPr>
+                <w:rFonts w:ascii="Arial Narrow" w:hAnsi="Arial Narrow"/>
+                <w:sz w:val="24"/>
+                <w:szCs w:val="24"/>
+              </w:rPr>
+              <w:t xml:space="preserve">Elaboração de </w:t>
+            </w:r>
+            <w:r>
+              <w:rPr>
+                <w:rFonts w:ascii="Arial Narrow" w:hAnsi="Arial Narrow"/>
+                <w:sz w:val="24"/>
+                <w:szCs w:val="24"/>
+              </w:rPr>
+              <w:t>o</w:t>
+            </w:r>
+            <w:r>
+              <w:rPr>
+                <w:rFonts w:ascii="Arial Narrow" w:hAnsi="Arial Narrow"/>
+                <w:sz w:val="24"/>
+                <w:szCs w:val="24"/>
+              </w:rPr>
+              <w:t>rçamento</w:t>
+            </w:r>
+            <w:r>
+              <w:rPr>
+                <w:rFonts w:ascii="Arial Narrow" w:hAnsi="Arial Narrow"/>
+                <w:sz w:val="24"/>
+                <w:szCs w:val="24"/>
+              </w:rPr>
+              <w:t>;</w:t>
+            </w:r>
+          </w:p>
+          <w:p>
+            <w:pPr>
+              <w:pStyle w:val="TableParagraph"/>
+              <w:numPr>
+                <w:ilvl w:val="0"/>
+                <w:numId w:val="6"/>
+              </w:numPr>
+              <w:tabs>
+                <w:tab w:val="left" w:pos="748"/>
+              </w:tabs>
+              <w:rPr>
+                <w:rFonts w:ascii="Arial Narrow" w:hAnsi="Arial Narrow"/>
+                <w:sz w:val="24"/>
+                <w:szCs w:val="24"/>
+              </w:rPr>
+            </w:pPr>
+            <w:r>
+              <w:rPr>
+                <w:rFonts w:ascii="Arial Narrow" w:hAnsi="Arial Narrow"/>
+                <w:sz w:val="24"/>
+                <w:szCs w:val="24"/>
+              </w:rPr>
+              <w:t xml:space="preserve">Elaboração de </w:t>
+            </w:r>
+            <w:r>
+              <w:rPr>
+                <w:rFonts w:ascii="Arial Narrow" w:hAnsi="Arial Narrow"/>
+                <w:sz w:val="24"/>
+                <w:szCs w:val="24"/>
+              </w:rPr>
+              <w:t>m</w:t>
+            </w:r>
+            <w:r>
+              <w:rPr>
+                <w:rFonts w:ascii="Arial Narrow" w:hAnsi="Arial Narrow"/>
+                <w:sz w:val="24"/>
+                <w:szCs w:val="24"/>
+              </w:rPr>
+              <w:t xml:space="preserve">emorial </w:t>
+            </w:r>
+            <w:r>
+              <w:rPr>
+                <w:rFonts w:ascii="Arial Narrow" w:hAnsi="Arial Narrow"/>
+                <w:sz w:val="24"/>
+                <w:szCs w:val="24"/>
+              </w:rPr>
+              <w:t>d</w:t>
+            </w:r>
+            <w:r>
+              <w:rPr>
+                <w:rFonts w:ascii="Arial Narrow" w:hAnsi="Arial Narrow"/>
+                <w:sz w:val="24"/>
+                <w:szCs w:val="24"/>
+              </w:rPr>
+              <w:t xml:space="preserve">escritivo </w:t>
+            </w:r>
+            <w:r>
+              <w:rPr>
+                <w:rFonts w:ascii="Arial Narrow" w:hAnsi="Arial Narrow"/>
+                <w:sz w:val="24"/>
+                <w:szCs w:val="24"/>
+              </w:rPr>
+              <w:t>e</w:t>
+            </w:r>
+            <w:r>
+              <w:rPr>
+                <w:rFonts w:ascii="Arial Narrow" w:hAnsi="Arial Narrow"/>
+                <w:sz w:val="24"/>
+                <w:szCs w:val="24"/>
+              </w:rPr>
+              <w:t xml:space="preserve"> </w:t>
+            </w:r>
+            <w:r>
+              <w:rPr>
+                <w:rFonts w:ascii="Arial Narrow" w:hAnsi="Arial Narrow"/>
+                <w:sz w:val="24"/>
+                <w:szCs w:val="24"/>
+              </w:rPr>
+              <w:t>e</w:t>
+            </w:r>
+            <w:r>
+              <w:rPr>
+                <w:rFonts w:ascii="Arial Narrow" w:hAnsi="Arial Narrow"/>
+                <w:sz w:val="24"/>
+                <w:szCs w:val="24"/>
+              </w:rPr>
+              <w:t xml:space="preserve">specificações </w:t>
+            </w:r>
+            <w:r>
+              <w:rPr>
+                <w:rFonts w:ascii="Arial Narrow" w:hAnsi="Arial Narrow"/>
+                <w:sz w:val="24"/>
+                <w:szCs w:val="24"/>
+              </w:rPr>
+              <w:t>t</w:t>
+            </w:r>
+            <w:r>
+              <w:rPr>
+                <w:rFonts w:ascii="Arial Narrow" w:hAnsi="Arial Narrow"/>
+                <w:sz w:val="24"/>
+                <w:szCs w:val="24"/>
+              </w:rPr>
+              <w:t>écnicas</w:t>
+            </w:r>
+            <w:r>
+              <w:rPr>
+                <w:rFonts w:ascii="Arial Narrow" w:hAnsi="Arial Narrow"/>
+                <w:sz w:val="24"/>
+                <w:szCs w:val="24"/>
+              </w:rPr>
+              <w:t>.</w:t>
+            </w:r>
+          </w:p>
+          <w:p>
+            <w:pPr>
+              <w:pStyle w:val="TableParagraph"/>
+              <w:numPr>
+                <w:ilvl w:val="0"/>
+                <w:numId w:val="4"/>
               </w:numPr>
               <w:tabs>
                 <w:tab w:val="left" w:pos="748"/>
@@ -1742,8 +1935,8 @@
               <w:ind w:left="747"/>
               <w:rPr>
                 <w:rFonts w:ascii="Arial Narrow" w:hAnsi="Arial Narrow"/>
-                <w:b w:val="1"/>
-                <w:bCs w:val="1"/>
+                <w:b/>
+                <w:bCs/>
                 <w:sz w:val="24"/>
                 <w:szCs w:val="24"/>
               </w:rPr>
@@ -1801,26 +1994,20 @@
             </w:r>
             <w:r>
               <w:rPr>
-                <w:rFonts w:ascii="Arial Narrow" w:hAnsi="Arial Narrow" w:eastAsia="Courier New" w:cs="Courier New"/>
-                <w:b w:val="1"/>
-                <w:bCs w:val="1"/>
-                <w:i w:val="0"/>
-                <w:iCs w:val="0"/>
-                <w:caps w:val="0"/>
-                <w:smallCaps w:val="0"/>
-                <w:noProof w:val="0"/>
-                <w:color w:val="000000" w:themeColor="text1" w:themeTint="FF" w:themeShade="FF"/>
-                <w:sz w:val="24"/>
-                <w:szCs w:val="24"/>
-                <w:lang w:val="pt-PT"/>
+                <w:rFonts w:ascii="Arial Narrow" w:hAnsi="Arial Narrow"/>
+                <w:b/>
+                <w:bCs/>
+                <w:color w:val="000000" w:themeColor="text1"/>
+                <w:sz w:val="24"/>
+                <w:szCs w:val="24"/>
               </w:rPr>
               <w:t>06/06/2024</w:t>
             </w:r>
             <w:r>
               <w:rPr>
                 <w:rFonts w:ascii="Arial Narrow" w:hAnsi="Arial Narrow"/>
-                <w:b w:val="1"/>
-                <w:bCs w:val="1"/>
+                <w:b/>
+                <w:bCs/>
                 <w:sz w:val="24"/>
                 <w:szCs w:val="24"/>
               </w:rPr>
@@ -1846,8 +2033,8 @@
             <w:r>
               <w:rPr>
                 <w:rFonts w:ascii="Arial Narrow" w:hAnsi="Arial Narrow"/>
-                <w:b w:val="1"/>
-                <w:bCs w:val="1"/>
+                <w:b/>
+                <w:bCs/>
                 <w:sz w:val="24"/>
                 <w:szCs w:val="24"/>
               </w:rPr>
@@ -1856,8 +2043,8 @@
             <w:r>
               <w:rPr>
                 <w:rFonts w:ascii="Arial Narrow" w:hAnsi="Arial Narrow"/>
-                <w:b w:val="1"/>
-                <w:bCs w:val="1"/>
+                <w:b/>
+                <w:bCs/>
                 <w:sz w:val="24"/>
                 <w:szCs w:val="24"/>
               </w:rPr>
@@ -1866,8 +2053,8 @@
             <w:r>
               <w:rPr>
                 <w:rFonts w:ascii="Arial Narrow" w:hAnsi="Arial Narrow"/>
-                <w:b w:val="1"/>
-                <w:bCs w:val="1"/>
+                <w:b/>
+                <w:bCs/>
                 <w:sz w:val="24"/>
                 <w:szCs w:val="24"/>
               </w:rPr>
@@ -1876,8 +2063,8 @@
             <w:r>
               <w:rPr>
                 <w:rFonts w:ascii="Arial Narrow" w:hAnsi="Arial Narrow"/>
-                <w:b w:val="1"/>
-                <w:bCs w:val="1"/>
+                <w:b/>
+                <w:bCs/>
                 <w:sz w:val="24"/>
                 <w:szCs w:val="24"/>
               </w:rPr>
@@ -1886,8 +2073,8 @@
             <w:r>
               <w:rPr>
                 <w:rFonts w:ascii="Arial Narrow" w:hAnsi="Arial Narrow"/>
-                <w:b w:val="1"/>
-                <w:bCs w:val="1"/>
+                <w:b/>
+                <w:bCs/>
                 <w:sz w:val="24"/>
                 <w:szCs w:val="24"/>
               </w:rPr>
@@ -2281,7 +2468,7 @@
     </w:p>
     <w:p>
       <w:pPr>
-        <w:ind w:left="5730"/>
+        <w:ind w:left="5529"/>
         <w:rPr>
           <w:rFonts w:ascii="Arial Narrow" w:hAnsi="Arial Narrow"/>
           <w:sz w:val="24"/>
@@ -2337,14 +2524,7 @@
           <w:rFonts w:ascii="Arial Narrow" w:hAnsi="Arial Narrow"/>
           <w:sz w:val="24"/>
         </w:rPr>
-        <w:t>2</w:t>
-      </w:r>
-      <w:r>
-        <w:rPr>
-          <w:rFonts w:ascii="Arial Narrow" w:hAnsi="Arial Narrow"/>
-          <w:sz w:val="24"/>
-        </w:rPr>
-        <w:t>8</w:t>
+        <w:t>14</w:t>
       </w:r>
       <w:r>
         <w:rPr>
@@ -2374,7 +2554,14 @@
           <w:rFonts w:ascii="Arial Narrow" w:hAnsi="Arial Narrow"/>
           <w:sz w:val="24"/>
         </w:rPr>
-        <w:t>abril de</w:t>
+        <w:t>agosto</w:t>
+      </w:r>
+      <w:r>
+        <w:rPr>
+          <w:rFonts w:ascii="Arial Narrow" w:hAnsi="Arial Narrow"/>
+          <w:sz w:val="24"/>
+        </w:rPr>
+        <w:t xml:space="preserve"> de</w:t>
       </w:r>
       <w:r>
         <w:rPr>
@@ -2764,7 +2951,27 @@
                                   <w:sz w:val="32"/>
                                   <w:lang w:val="pt-BR"/>
                                 </w:rPr>
-                                <w:t>JOSE FERREIRA DE OLIVEIRA</w:t>
+                                <w:t>JOS</w:t>
+                              </w:r>
+                              <w:r>
+                                <w:rPr>
+                                  <w:rFonts w:ascii="Arial Narrow"/>
+                                  <w:b/>
+                                  <w:color w:val="333333"/>
+                                  <w:sz w:val="32"/>
+                                  <w:lang w:val="pt-BR"/>
+                                </w:rPr>
+                                <w:t>E</w:t>
+                              </w:r>
+                              <w:r>
+                                <w:rPr>
+                                  <w:rFonts w:ascii="Arial Narrow"/>
+                                  <w:b/>
+                                  <w:color w:val="333333"/>
+                                  <w:sz w:val="32"/>
+                                  <w:lang w:val="pt-BR"/>
+                                </w:rPr>
+                                <w:t xml:space="preserve"> FERREIRA DE OLIVEIRA</w:t>
                               </w:r>
                             </w:p>
                           </w:txbxContent>
@@ -2787,16 +2994,16 @@
           </mc:Choice>
           <mc:Fallback>
             <w:pict>
-              <v:group id="Group 2" style="position:absolute;left:0;text-align:left;margin-left:261.75pt;margin-top:17.8pt;width:255.35pt;height:18.4pt;z-index:-251657216;mso-wrap-distance-left:0;mso-wrap-distance-right:0;mso-position-horizontal-relative:page" coordsize="5107,368" coordorigin="6330,356" o:spid="_x0000_s1026" w14:anchorId="59358AFE" o:gfxdata="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">
-                <v:shape id="AutoShape 5" style="position:absolute;left:6330;top:379;width:5107;height:2;visibility:visible;mso-wrap-style:square;v-text-anchor:top" coordsize="5107,2" o:spid="_x0000_s1027" filled="f" strokeweight=".5pt" path="m,l1824,t5,l5107,e" o:gfxdata="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">
+              <v:group w14:anchorId="59358AFE" id="Group 2" o:spid="_x0000_s1026" style="position:absolute;left:0;text-align:left;margin-left:261.75pt;margin-top:17.8pt;width:255.35pt;height:18.4pt;z-index:-251657216;mso-wrap-distance-left:0;mso-wrap-distance-right:0;mso-position-horizontal-relative:page" coordorigin="6330,356" coordsize="5107,368" o:gfxdata="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">
+                <v:shape id="AutoShape 5" o:spid="_x0000_s1027" style="position:absolute;left:6330;top:379;width:5107;height:2;visibility:visible;mso-wrap-style:square;v-text-anchor:top" coordsize="5107,2" o:gfxdata="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" path="m,l1824,t5,l5107,e" filled="f" strokeweight=".5pt">
                   <v:path arrowok="t" o:connecttype="custom" o:connectlocs="0,0;1824,0;1829,0;5107,0" o:connectangles="0,0,0,0"/>
                 </v:shape>
-                <v:rect id="Rectangle 4" style="position:absolute;left:6890;top:447;width:3994;height:260;visibility:visible;mso-wrap-style:square;v-text-anchor:top" o:spid="_x0000_s1028" fillcolor="#f9f9f9" stroked="f" o:gfxdata="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"/>
+                <v:rect id="Rectangle 4" o:spid="_x0000_s1028" style="position:absolute;left:6890;top:447;width:3994;height:260;visibility:visible;mso-wrap-style:square;v-text-anchor:top" o:gfxdata="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" fillcolor="#f9f9f9" stroked="f"/>
                 <v:shapetype id="_x0000_t202" coordsize="21600,21600" o:spt="202" path="m,l,21600r21600,l21600,xe">
                   <v:stroke joinstyle="miter"/>
                   <v:path gradientshapeok="t" o:connecttype="rect"/>
                 </v:shapetype>
-                <v:shape id="Text Box 3" style="position:absolute;left:6330;top:356;width:5107;height:368;visibility:visible;mso-wrap-style:square;v-text-anchor:top" o:spid="_x0000_s1029" filled="f" stroked="f" type="#_x0000_t202" o:gfxdata="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">
+                <v:shape id="Text Box 3" o:spid="_x0000_s1029" type="#_x0000_t202" style="position:absolute;left:6330;top:356;width:5107;height:368;visibility:visible;mso-wrap-style:square;v-text-anchor:top" o:gfxdata="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" filled="f" stroked="f">
                   <v:textbox inset="0,0,0,0">
                     <w:txbxContent>
                       <w:p>
@@ -2818,7 +3025,27 @@
                             <w:sz w:val="32"/>
                             <w:lang w:val="pt-BR"/>
                           </w:rPr>
-                          <w:t>JOSE FERREIRA DE OLIVEIRA</w:t>
+                          <w:t>JOS</w:t>
+                        </w:r>
+                        <w:r>
+                          <w:rPr>
+                            <w:rFonts w:ascii="Arial Narrow"/>
+                            <w:b/>
+                            <w:color w:val="333333"/>
+                            <w:sz w:val="32"/>
+                            <w:lang w:val="pt-BR"/>
+                          </w:rPr>
+                          <w:t>E</w:t>
+                        </w:r>
+                        <w:r>
+                          <w:rPr>
+                            <w:rFonts w:ascii="Arial Narrow"/>
+                            <w:b/>
+                            <w:color w:val="333333"/>
+                            <w:sz w:val="32"/>
+                            <w:lang w:val="pt-BR"/>
+                          </w:rPr>
+                          <w:t xml:space="preserve"> FERREIRA DE OLIVEIRA</w:t>
                         </w:r>
                       </w:p>
                     </w:txbxContent>
@@ -2843,7 +3070,7 @@
         <w:sectPr>
           <w:headerReference w:type="default" r:id="rId7"/>
           <w:type w:val="continuous"/>
-          <w:pgSz w:w="11900" w:h="16840" w:orient="portrait"/>
+          <w:pgSz w:w="11900" w:h="16840"/>
           <w:pgMar w:top="680" w:right="1552" w:bottom="280" w:left="1160" w:header="720" w:footer="720" w:gutter="0"/>
           <w:cols w:space="720"/>
           <w:docGrid w:linePitch="299"/>
@@ -2904,13 +3131,11 @@
       </w:r>
       <w:r>
         <w:rPr>
-          <w:rFonts w:ascii="Times New Roman" w:hAnsi="Times New Roman" w:eastAsia="Courier New" w:cs="Times New Roman"/>
+          <w:rFonts w:ascii="Times New Roman" w:hAnsi="Times New Roman" w:cs="Times New Roman"/>
           <w:b w:val="0"/>
           <w:bCs w:val="0"/>
-          <w:noProof w:val="0"/>
           <w:sz w:val="24"/>
           <w:szCs w:val="24"/>
-          <w:lang w:val="pt-PT"/>
         </w:rPr>
         <w:t>ELABORAÇÃO DE PROJETO, ORÇAMENTO E ESPECIFICAÇÕES DO CEASM - CENTRO ESPECIALIZADO DE ATENÇÃO À SAÚDE MENTAL COM ÁREA DE 467,04 M² PARA A CIDADE DE COREMAS – PB.</w:t>
       </w:r>
@@ -3055,17 +3280,9 @@
         <w:spacing w:before="120"/>
         <w:ind w:left="747"/>
         <w:rPr>
-          <w:rFonts w:ascii="Times New Roman" w:hAnsi="Times New Roman" w:eastAsia="Courier New" w:cs="Times New Roman"/>
-          <w:b w:val="1"/>
-          <w:bCs w:val="1"/>
-          <w:i w:val="0"/>
-          <w:iCs w:val="0"/>
-          <w:caps w:val="0"/>
-          <w:smallCaps w:val="0"/>
-          <w:noProof w:val="0"/>
+          <w:rFonts w:ascii="Times New Roman" w:hAnsi="Times New Roman" w:cs="Times New Roman"/>
           <w:sz w:val="24"/>
           <w:szCs w:val="24"/>
-          <w:lang w:val="pt-PT"/>
         </w:rPr>
       </w:pPr>
       <w:r>
@@ -3078,7 +3295,7 @@
       </w:r>
       <w:r>
         <w:rPr>
-          <w:rFonts w:ascii="Times New Roman" w:hAnsi="Times New Roman" w:eastAsia="Courier New" w:cs="Times New Roman"/>
+          <w:rFonts w:ascii="Times New Roman" w:hAnsi="Times New Roman" w:cs="Times New Roman"/>
           <w:b w:val="0"/>
           <w:bCs w:val="0"/>
           <w:sz w:val="24"/>
@@ -3088,17 +3305,11 @@
       </w:r>
       <w:r>
         <w:rPr>
-          <w:rFonts w:ascii="Times New Roman" w:hAnsi="Times New Roman" w:eastAsia="Courier New" w:cs="Times New Roman"/>
+          <w:rFonts w:ascii="Times New Roman" w:hAnsi="Times New Roman" w:cs="Times New Roman"/>
           <w:b w:val="0"/>
           <w:bCs w:val="0"/>
-          <w:i w:val="0"/>
-          <w:iCs w:val="0"/>
-          <w:caps w:val="0"/>
-          <w:smallCaps w:val="0"/>
-          <w:noProof w:val="0"/>
           <w:sz w:val="24"/>
           <w:szCs w:val="24"/>
-          <w:lang w:val="pt-PT"/>
         </w:rPr>
         <w:t>RUA MARIA FARIAS DE ASSIS, ESTAÇÃO DA LUZ</w:t>
       </w:r>
@@ -3109,7 +3320,7 @@
         <w:spacing w:before="120"/>
         <w:ind w:left="709"/>
         <w:rPr>
-          <w:rFonts w:ascii="Times New Roman" w:hAnsi="Times New Roman" w:eastAsia="Courier New" w:cs="Times New Roman"/>
+          <w:rFonts w:ascii="Times New Roman" w:hAnsi="Times New Roman" w:cs="Times New Roman"/>
           <w:b w:val="0"/>
           <w:bCs w:val="0"/>
           <w:sz w:val="24"/>
@@ -3199,26 +3410,29 @@
         <w:jc w:val="center"/>
       </w:pPr>
       <w:r>
+        <w:rPr>
+          <w:noProof/>
+        </w:rPr>
         <w:drawing>
-          <wp:inline wp14:editId="56526FDE" wp14:anchorId="22373587">
+          <wp:inline distT="0" distB="0" distL="0" distR="0" wp14:anchorId="22373587" wp14:editId="56526FDE">
             <wp:extent cx="3781425" cy="6229350"/>
             <wp:effectExtent l="0" t="0" r="0" b="0"/>
-            <wp:docPr id="1329438919" name="" title=""/>
+            <wp:docPr id="1329438919" name="Imagem 1329438919"/>
             <wp:cNvGraphicFramePr>
-              <a:graphicFrameLocks noChangeAspect="1"/>
+              <a:graphicFrameLocks xmlns:a="http://schemas.openxmlformats.org/drawingml/2006/main" noChangeAspect="1"/>
             </wp:cNvGraphicFramePr>
-            <a:graphic>
+            <a:graphic xmlns:a="http://schemas.openxmlformats.org/drawingml/2006/main">
               <a:graphicData uri="http://schemas.openxmlformats.org/drawingml/2006/picture">
-                <pic:pic>
+                <pic:pic xmlns:pic="http://schemas.openxmlformats.org/drawingml/2006/picture">
                   <pic:nvPicPr>
                     <pic:cNvPr id="0" name=""/>
                     <pic:cNvPicPr/>
                   </pic:nvPicPr>
                   <pic:blipFill>
-                    <a:blip r:embed="R4baae2e264ec4c8f">
+                    <a:blip r:embed="rId8">
                       <a:extLst>
-                        <a:ext xmlns:a="http://schemas.openxmlformats.org/drawingml/2006/main" uri="{28A0092B-C50C-407E-A947-70E740481C1C}">
-                          <a14:useLocalDpi val="0"/>
+                        <a:ext uri="{28A0092B-C50C-407E-A947-70E740481C1C}">
+                          <a14:useLocalDpi xmlns:a14="http://schemas.microsoft.com/office/drawing/2010/main" val="0"/>
                         </a:ext>
                       </a:extLst>
                     </a:blip>
@@ -3247,26 +3461,30 @@
         <w:jc w:val="center"/>
       </w:pPr>
       <w:r>
+        <w:rPr>
+          <w:noProof/>
+        </w:rPr>
+        <w:lastRenderedPageBreak/>
         <w:drawing>
-          <wp:inline wp14:editId="352FD3B9" wp14:anchorId="40D37AB6">
+          <wp:inline distT="0" distB="0" distL="0" distR="0" wp14:anchorId="40D37AB6" wp14:editId="352FD3B9">
             <wp:extent cx="4809963" cy="8119658"/>
             <wp:effectExtent l="0" t="0" r="0" b="0"/>
-            <wp:docPr id="1690101898" name="" title=""/>
+            <wp:docPr id="1690101898" name="Imagem 1690101898"/>
             <wp:cNvGraphicFramePr>
-              <a:graphicFrameLocks noChangeAspect="1"/>
+              <a:graphicFrameLocks xmlns:a="http://schemas.openxmlformats.org/drawingml/2006/main" noChangeAspect="1"/>
             </wp:cNvGraphicFramePr>
-            <a:graphic>
+            <a:graphic xmlns:a="http://schemas.openxmlformats.org/drawingml/2006/main">
               <a:graphicData uri="http://schemas.openxmlformats.org/drawingml/2006/picture">
-                <pic:pic>
+                <pic:pic xmlns:pic="http://schemas.openxmlformats.org/drawingml/2006/picture">
                   <pic:nvPicPr>
                     <pic:cNvPr id="0" name=""/>
                     <pic:cNvPicPr/>
                   </pic:nvPicPr>
                   <pic:blipFill>
-                    <a:blip r:embed="R021d58a115d346a8">
+                    <a:blip r:embed="rId9">
                       <a:extLst>
-                        <a:ext xmlns:a="http://schemas.openxmlformats.org/drawingml/2006/main" uri="{28A0092B-C50C-407E-A947-70E740481C1C}">
-                          <a14:useLocalDpi val="0"/>
+                        <a:ext uri="{28A0092B-C50C-407E-A947-70E740481C1C}">
+                          <a14:useLocalDpi xmlns:a14="http://schemas.microsoft.com/office/drawing/2010/main" val="0"/>
                         </a:ext>
                       </a:extLst>
                     </a:blip>
@@ -3292,7 +3510,6 @@
     </w:p>
     <w:p>
       <w:pPr>
-        <w:pStyle w:val="Normal"/>
         <w:rPr>
           <w:sz w:val="16"/>
           <w:szCs w:val="16"/>
@@ -3304,26 +3521,30 @@
         <w:jc w:val="center"/>
       </w:pPr>
       <w:r>
+        <w:rPr>
+          <w:noProof/>
+        </w:rPr>
+        <w:lastRenderedPageBreak/>
         <w:drawing>
-          <wp:inline wp14:editId="6538F11D" wp14:anchorId="3F837418">
+          <wp:inline distT="0" distB="0" distL="0" distR="0" wp14:anchorId="3F837418" wp14:editId="6538F11D">
             <wp:extent cx="4959262" cy="8108394"/>
             <wp:effectExtent l="0" t="0" r="0" b="0"/>
-            <wp:docPr id="2108241118" name="" title=""/>
+            <wp:docPr id="2108241118" name="Imagem 2108241118"/>
             <wp:cNvGraphicFramePr>
-              <a:graphicFrameLocks noChangeAspect="1"/>
+              <a:graphicFrameLocks xmlns:a="http://schemas.openxmlformats.org/drawingml/2006/main" noChangeAspect="1"/>
             </wp:cNvGraphicFramePr>
-            <a:graphic>
+            <a:graphic xmlns:a="http://schemas.openxmlformats.org/drawingml/2006/main">
               <a:graphicData uri="http://schemas.openxmlformats.org/drawingml/2006/picture">
-                <pic:pic>
+                <pic:pic xmlns:pic="http://schemas.openxmlformats.org/drawingml/2006/picture">
                   <pic:nvPicPr>
                     <pic:cNvPr id="0" name=""/>
                     <pic:cNvPicPr/>
                   </pic:nvPicPr>
                   <pic:blipFill>
-                    <a:blip r:embed="R0986abb6f97c4ad4">
+                    <a:blip r:embed="rId10">
                       <a:extLst>
-                        <a:ext xmlns:a="http://schemas.openxmlformats.org/drawingml/2006/main" uri="{28A0092B-C50C-407E-A947-70E740481C1C}">
-                          <a14:useLocalDpi val="0"/>
+                        <a:ext uri="{28A0092B-C50C-407E-A947-70E740481C1C}">
+                          <a14:useLocalDpi xmlns:a14="http://schemas.microsoft.com/office/drawing/2010/main" val="0"/>
                         </a:ext>
                       </a:extLst>
                     </a:blip>
@@ -3377,13 +3598,11 @@
         </w:rPr>
       </w:pPr>
     </w:p>
-    <w:p w14:noSpellErr="1">
-      <w:pPr>
-        <w:pStyle w:val="Normal"/>
+    <w:p>
+      <w:pPr>
         <w:tabs>
           <w:tab w:val="left" w:pos="9030"/>
         </w:tabs>
-        <w:ind/>
         <w:rPr>
           <w:sz w:val="16"/>
           <w:szCs w:val="16"/>
@@ -3393,31 +3612,34 @@
     <w:p>
       <w:pPr>
         <w:tabs>
-          <w:tab w:val="left" w:leader="none" w:pos="9030"/>
+          <w:tab w:val="left" w:pos="9030"/>
         </w:tabs>
         <w:jc w:val="right"/>
       </w:pPr>
       <w:r>
+        <w:rPr>
+          <w:noProof/>
+        </w:rPr>
         <w:drawing>
-          <wp:inline wp14:editId="6505EB3D" wp14:anchorId="62EB2FE4">
+          <wp:inline distT="0" distB="0" distL="0" distR="0" wp14:anchorId="62EB2FE4" wp14:editId="6505EB3D">
             <wp:extent cx="5449060" cy="3277057"/>
             <wp:effectExtent l="0" t="0" r="0" b="0"/>
-            <wp:docPr id="178869397" name="" title=""/>
+            <wp:docPr id="178869397" name="Imagem 178869397"/>
             <wp:cNvGraphicFramePr>
-              <a:graphicFrameLocks noChangeAspect="1"/>
+              <a:graphicFrameLocks xmlns:a="http://schemas.openxmlformats.org/drawingml/2006/main" noChangeAspect="1"/>
             </wp:cNvGraphicFramePr>
-            <a:graphic>
+            <a:graphic xmlns:a="http://schemas.openxmlformats.org/drawingml/2006/main">
               <a:graphicData uri="http://schemas.openxmlformats.org/drawingml/2006/picture">
-                <pic:pic>
+                <pic:pic xmlns:pic="http://schemas.openxmlformats.org/drawingml/2006/picture">
                   <pic:nvPicPr>
                     <pic:cNvPr id="0" name=""/>
                     <pic:cNvPicPr/>
                   </pic:nvPicPr>
                   <pic:blipFill>
-                    <a:blip r:embed="R114553bf73754b77">
+                    <a:blip r:embed="rId11">
                       <a:extLst>
-                        <a:ext xmlns:a="http://schemas.openxmlformats.org/drawingml/2006/main" uri="{28A0092B-C50C-407E-A947-70E740481C1C}">
-                          <a14:useLocalDpi val="0"/>
+                        <a:ext uri="{28A0092B-C50C-407E-A947-70E740481C1C}">
+                          <a14:useLocalDpi xmlns:a14="http://schemas.microsoft.com/office/drawing/2010/main" val="0"/>
                         </a:ext>
                       </a:extLst>
                     </a:blip>
@@ -3442,9 +3664,9 @@
       </w:r>
     </w:p>
     <w:sectPr>
-      <w:headerReference w:type="default" r:id="rId14"/>
-      <w:footerReference w:type="default" r:id="rId15"/>
-      <w:pgSz w:w="11910" w:h="16840" w:orient="portrait"/>
+      <w:headerReference w:type="default" r:id="rId12"/>
+      <w:footerReference w:type="default" r:id="rId13"/>
+      <w:pgSz w:w="11910" w:h="16840"/>
       <w:pgMar w:top="2040" w:right="1540" w:bottom="1400" w:left="580" w:header="697" w:footer="1214" w:gutter="0"/>
       <w:cols w:space="720"/>
     </w:sectPr>
@@ -3453,7 +3675,7 @@
 </file>
 
 <file path=word/endnotes.xml><?xml version="1.0" encoding="utf-8"?>
-<w:endnotes xmlns:wpc="http://schemas.microsoft.com/office/word/2010/wordprocessingCanvas" xmlns:cx="http://schemas.microsoft.com/office/drawing/2014/chartex" xmlns:cx1="http://schemas.microsoft.com/office/drawing/2015/9/8/chartex" xmlns:cx2="http://schemas.microsoft.com/office/drawing/2015/10/21/chartex" xmlns:cx3="http://schemas.microsoft.com/office/drawing/2016/5/9/chartex" xmlns:cx4="http://schemas.microsoft.com/office/drawing/2016/5/10/chartex" xmlns:cx5="http://schemas.microsoft.com/office/drawing/2016/5/11/chartex" xmlns:cx6="http://schemas.microsoft.com/office/drawing/2016/5/12/chartex" xmlns:cx7="http://schemas.microsoft.com/office/drawing/2016/5/13/chartex" xmlns:cx8="http://schemas.microsoft.com/office/drawing/2016/5/14/chartex" xmlns:mc="http://schemas.openxmlformats.org/markup-compatibility/2006" xmlns:aink="http://schemas.microsoft.com/office/drawing/2016/ink" xmlns:am3d="http://schemas.microsoft.com/office/drawing/2017/model3d" xmlns:o="urn:schemas-microsoft-com:office:office" xmlns:oel="http://schemas.microsoft.com/office/2019/extlst" xmlns:r="http://schemas.openxmlformats.org/officeDocument/2006/relationships" xmlns:m="http://schemas.openxmlformats.org/officeDocument/2006/math" xmlns:v="urn:schemas-microsoft-com:vml" xmlns:wp14="http://schemas.microsoft.com/office/word/2010/wordprocessingDrawing" xmlns:wp="http://schemas.openxmlformats.org/drawingml/2006/wordprocessingDrawing" xmlns:w10="urn:schemas-microsoft-com:office:word" xmlns:w="http://schemas.openxmlformats.org/wordprocessingml/2006/main" xmlns:w14="http://schemas.microsoft.com/office/word/2010/wordml" xmlns:w15="http://schemas.microsoft.com/office/word/2012/wordml" xmlns:w16cex="http://schemas.microsoft.com/office/word/2018/wordml/cex" xmlns:w16cid="http://schemas.microsoft.com/office/word/2016/wordml/cid" xmlns:w16="http://schemas.microsoft.com/office/word/2018/wordml" xmlns:w16du="http://schemas.microsoft.com/office/word/2023/wordml/word16du" xmlns:w16sdtdh="http://schemas.microsoft.com/office/word/2020/wordml/sdtdatahash" xmlns:w16sdtfl="http://schemas.microsoft.com/office/word/2024/wordml/sdtformatlock" xmlns:w16se="http://schemas.microsoft.com/office/word/2015/wordml/symex" xmlns:wpg="http://schemas.microsoft.com/office/word/2010/wordprocessingGroup" xmlns:wpi="http://schemas.microsoft.com/office/word/2010/wordprocessingInk" xmlns:wne="http://schemas.microsoft.com/office/word/2006/wordml" xmlns:wps="http://schemas.microsoft.com/office/word/2010/wordprocessingShape" mc:Ignorable="w14 w15 w16se w16cid w16 w16cex w16sdtdh w16sdtfl w16du wp14">
+<w:endnotes xmlns:wpc="http://schemas.microsoft.com/office/word/2010/wordprocessingCanvas" xmlns:cx="http://schemas.microsoft.com/office/drawing/2014/chartex" xmlns:cx1="http://schemas.microsoft.com/office/drawing/2015/9/8/chartex" xmlns:cx2="http://schemas.microsoft.com/office/drawing/2015/10/21/chartex" xmlns:cx3="http://schemas.microsoft.com/office/drawing/2016/5/9/chartex" xmlns:cx4="http://schemas.microsoft.com/office/drawing/2016/5/10/chartex" xmlns:cx5="http://schemas.microsoft.com/office/drawing/2016/5/11/chartex" xmlns:cx6="http://schemas.microsoft.com/office/drawing/2016/5/12/chartex" xmlns:cx7="http://schemas.microsoft.com/office/drawing/2016/5/13/chartex" xmlns:cx8="http://schemas.microsoft.com/office/drawing/2016/5/14/chartex" xmlns:mc="http://schemas.openxmlformats.org/markup-compatibility/2006" xmlns:aink="http://schemas.microsoft.com/office/drawing/2016/ink" xmlns:am3d="http://schemas.microsoft.com/office/drawing/2017/model3d" xmlns:o="urn:schemas-microsoft-com:office:office" xmlns:r="http://schemas.openxmlformats.org/officeDocument/2006/relationships" xmlns:m="http://schemas.openxmlformats.org/officeDocument/2006/math" xmlns:v="urn:schemas-microsoft-com:vml" xmlns:wp14="http://schemas.microsoft.com/office/word/2010/wordprocessingDrawing" xmlns:wp="http://schemas.openxmlformats.org/drawingml/2006/wordprocessingDrawing" xmlns:w10="urn:schemas-microsoft-com:office:word" xmlns:w="http://schemas.openxmlformats.org/wordprocessingml/2006/main" xmlns:w14="http://schemas.microsoft.com/office/word/2010/wordml" xmlns:w15="http://schemas.microsoft.com/office/word/2012/wordml" xmlns:w16cex="http://schemas.microsoft.com/office/word/2018/wordml/cex" xmlns:w16cid="http://schemas.microsoft.com/office/word/2016/wordml/cid" xmlns:w16="http://schemas.microsoft.com/office/word/2018/wordml" xmlns:w16sdtdh="http://schemas.microsoft.com/office/word/2020/wordml/sdtdatahash" xmlns:w16se="http://schemas.microsoft.com/office/word/2015/wordml/symex" xmlns:wpg="http://schemas.microsoft.com/office/word/2010/wordprocessingGroup" xmlns:wpi="http://schemas.microsoft.com/office/word/2010/wordprocessingInk" xmlns:wne="http://schemas.microsoft.com/office/word/2006/wordml" xmlns:wps="http://schemas.microsoft.com/office/word/2010/wordprocessingShape" mc:Ignorable="w14 w15 w16se w16cid w16 w16cex w16sdtdh wp14">
   <w:endnote w:type="separator" w:id="-1">
     <w:p>
       <w:r>
@@ -3472,7 +3694,7 @@
 </file>
 
 <file path=word/footer1.xml><?xml version="1.0" encoding="utf-8"?>
-<w:ftr xmlns:wpc="http://schemas.microsoft.com/office/word/2010/wordprocessingCanvas" xmlns:cx="http://schemas.microsoft.com/office/drawing/2014/chartex" xmlns:cx1="http://schemas.microsoft.com/office/drawing/2015/9/8/chartex" xmlns:cx2="http://schemas.microsoft.com/office/drawing/2015/10/21/chartex" xmlns:cx3="http://schemas.microsoft.com/office/drawing/2016/5/9/chartex" xmlns:cx4="http://schemas.microsoft.com/office/drawing/2016/5/10/chartex" xmlns:cx5="http://schemas.microsoft.com/office/drawing/2016/5/11/chartex" xmlns:cx6="http://schemas.microsoft.com/office/drawing/2016/5/12/chartex" xmlns:cx7="http://schemas.microsoft.com/office/drawing/2016/5/13/chartex" xmlns:cx8="http://schemas.microsoft.com/office/drawing/2016/5/14/chartex" xmlns:mc="http://schemas.openxmlformats.org/markup-compatibility/2006" xmlns:aink="http://schemas.microsoft.com/office/drawing/2016/ink" xmlns:am3d="http://schemas.microsoft.com/office/drawing/2017/model3d" xmlns:o="urn:schemas-microsoft-com:office:office" xmlns:oel="http://schemas.microsoft.com/office/2019/extlst" xmlns:r="http://schemas.openxmlformats.org/officeDocument/2006/relationships" xmlns:m="http://schemas.openxmlformats.org/officeDocument/2006/math" xmlns:v="urn:schemas-microsoft-com:vml" xmlns:wp14="http://schemas.microsoft.com/office/word/2010/wordprocessingDrawing" xmlns:wp="http://schemas.openxmlformats.org/drawingml/2006/wordprocessingDrawing" xmlns:w10="urn:schemas-microsoft-com:office:word" xmlns:w="http://schemas.openxmlformats.org/wordprocessingml/2006/main" xmlns:w14="http://schemas.microsoft.com/office/word/2010/wordml" xmlns:w15="http://schemas.microsoft.com/office/word/2012/wordml" xmlns:w16cex="http://schemas.microsoft.com/office/word/2018/wordml/cex" xmlns:w16cid="http://schemas.microsoft.com/office/word/2016/wordml/cid" xmlns:w16="http://schemas.microsoft.com/office/word/2018/wordml" xmlns:w16du="http://schemas.microsoft.com/office/word/2023/wordml/word16du" xmlns:w16sdtdh="http://schemas.microsoft.com/office/word/2020/wordml/sdtdatahash" xmlns:w16sdtfl="http://schemas.microsoft.com/office/word/2024/wordml/sdtformatlock" xmlns:w16se="http://schemas.microsoft.com/office/word/2015/wordml/symex" xmlns:wpg="http://schemas.microsoft.com/office/word/2010/wordprocessingGroup" xmlns:wpi="http://schemas.microsoft.com/office/word/2010/wordprocessingInk" xmlns:wne="http://schemas.microsoft.com/office/word/2006/wordml" xmlns:wps="http://schemas.microsoft.com/office/word/2010/wordprocessingShape" xmlns:a="http://schemas.openxmlformats.org/drawingml/2006/main" xmlns:pic="http://schemas.openxmlformats.org/drawingml/2006/picture" xmlns:a14="http://schemas.microsoft.com/office/drawing/2010/main" mc:Ignorable="w14 w15 w16se w16cid w16 w16cex w16sdtdh w16sdtfl w16du wp14">
+<w:ftr xmlns:wpc="http://schemas.microsoft.com/office/word/2010/wordprocessingCanvas" xmlns:cx="http://schemas.microsoft.com/office/drawing/2014/chartex" xmlns:cx1="http://schemas.microsoft.com/office/drawing/2015/9/8/chartex" xmlns:cx2="http://schemas.microsoft.com/office/drawing/2015/10/21/chartex" xmlns:cx3="http://schemas.microsoft.com/office/drawing/2016/5/9/chartex" xmlns:cx4="http://schemas.microsoft.com/office/drawing/2016/5/10/chartex" xmlns:cx5="http://schemas.microsoft.com/office/drawing/2016/5/11/chartex" xmlns:cx6="http://schemas.microsoft.com/office/drawing/2016/5/12/chartex" xmlns:cx7="http://schemas.microsoft.com/office/drawing/2016/5/13/chartex" xmlns:cx8="http://schemas.microsoft.com/office/drawing/2016/5/14/chartex" xmlns:mc="http://schemas.openxmlformats.org/markup-compatibility/2006" xmlns:aink="http://schemas.microsoft.com/office/drawing/2016/ink" xmlns:am3d="http://schemas.microsoft.com/office/drawing/2017/model3d" xmlns:o="urn:schemas-microsoft-com:office:office" xmlns:r="http://schemas.openxmlformats.org/officeDocument/2006/relationships" xmlns:m="http://schemas.openxmlformats.org/officeDocument/2006/math" xmlns:v="urn:schemas-microsoft-com:vml" xmlns:wp14="http://schemas.microsoft.com/office/word/2010/wordprocessingDrawing" xmlns:wp="http://schemas.openxmlformats.org/drawingml/2006/wordprocessingDrawing" xmlns:w10="urn:schemas-microsoft-com:office:word" xmlns:w="http://schemas.openxmlformats.org/wordprocessingml/2006/main" xmlns:w14="http://schemas.microsoft.com/office/word/2010/wordml" xmlns:w15="http://schemas.microsoft.com/office/word/2012/wordml" xmlns:w16cex="http://schemas.microsoft.com/office/word/2018/wordml/cex" xmlns:w16cid="http://schemas.microsoft.com/office/word/2016/wordml/cid" xmlns:w16="http://schemas.microsoft.com/office/word/2018/wordml" xmlns:w16sdtdh="http://schemas.microsoft.com/office/word/2020/wordml/sdtdatahash" xmlns:w16se="http://schemas.microsoft.com/office/word/2015/wordml/symex" xmlns:wpg="http://schemas.microsoft.com/office/word/2010/wordprocessingGroup" xmlns:wpi="http://schemas.microsoft.com/office/word/2010/wordprocessingInk" xmlns:wne="http://schemas.microsoft.com/office/word/2006/wordml" xmlns:wps="http://schemas.microsoft.com/office/word/2010/wordprocessingShape" mc:Ignorable="w14 w15 w16se w16cid w16 w16cex w16sdtdh wp14">
   <w:p>
     <w:pPr>
       <w:pStyle w:val="Corpodetexto"/>
@@ -3545,7 +3767,7 @@
 </file>
 
 <file path=word/footnotes.xml><?xml version="1.0" encoding="utf-8"?>
-<w:footnotes xmlns:wpc="http://schemas.microsoft.com/office/word/2010/wordprocessingCanvas" xmlns:cx="http://schemas.microsoft.com/office/drawing/2014/chartex" xmlns:cx1="http://schemas.microsoft.com/office/drawing/2015/9/8/chartex" xmlns:cx2="http://schemas.microsoft.com/office/drawing/2015/10/21/chartex" xmlns:cx3="http://schemas.microsoft.com/office/drawing/2016/5/9/chartex" xmlns:cx4="http://schemas.microsoft.com/office/drawing/2016/5/10/chartex" xmlns:cx5="http://schemas.microsoft.com/office/drawing/2016/5/11/chartex" xmlns:cx6="http://schemas.microsoft.com/office/drawing/2016/5/12/chartex" xmlns:cx7="http://schemas.microsoft.com/office/drawing/2016/5/13/chartex" xmlns:cx8="http://schemas.microsoft.com/office/drawing/2016/5/14/chartex" xmlns:mc="http://schemas.openxmlformats.org/markup-compatibility/2006" xmlns:aink="http://schemas.microsoft.com/office/drawing/2016/ink" xmlns:am3d="http://schemas.microsoft.com/office/drawing/2017/model3d" xmlns:o="urn:schemas-microsoft-com:office:office" xmlns:oel="http://schemas.microsoft.com/office/2019/extlst" xmlns:r="http://schemas.openxmlformats.org/officeDocument/2006/relationships" xmlns:m="http://schemas.openxmlformats.org/officeDocument/2006/math" xmlns:v="urn:schemas-microsoft-com:vml" xmlns:wp14="http://schemas.microsoft.com/office/word/2010/wordprocessingDrawing" xmlns:wp="http://schemas.openxmlformats.org/drawingml/2006/wordprocessingDrawing" xmlns:w10="urn:schemas-microsoft-com:office:word" xmlns:w="http://schemas.openxmlformats.org/wordprocessingml/2006/main" xmlns:w14="http://schemas.microsoft.com/office/word/2010/wordml" xmlns:w15="http://schemas.microsoft.com/office/word/2012/wordml" xmlns:w16cex="http://schemas.microsoft.com/office/word/2018/wordml/cex" xmlns:w16cid="http://schemas.microsoft.com/office/word/2016/wordml/cid" xmlns:w16="http://schemas.microsoft.com/office/word/2018/wordml" xmlns:w16du="http://schemas.microsoft.com/office/word/2023/wordml/word16du" xmlns:w16sdtdh="http://schemas.microsoft.com/office/word/2020/wordml/sdtdatahash" xmlns:w16sdtfl="http://schemas.microsoft.com/office/word/2024/wordml/sdtformatlock" xmlns:w16se="http://schemas.microsoft.com/office/word/2015/wordml/symex" xmlns:wpg="http://schemas.microsoft.com/office/word/2010/wordprocessingGroup" xmlns:wpi="http://schemas.microsoft.com/office/word/2010/wordprocessingInk" xmlns:wne="http://schemas.microsoft.com/office/word/2006/wordml" xmlns:wps="http://schemas.microsoft.com/office/word/2010/wordprocessingShape" mc:Ignorable="w14 w15 w16se w16cid w16 w16cex w16sdtdh w16sdtfl w16du wp14">
+<w:footnotes xmlns:wpc="http://schemas.microsoft.com/office/word/2010/wordprocessingCanvas" xmlns:cx="http://schemas.microsoft.com/office/drawing/2014/chartex" xmlns:cx1="http://schemas.microsoft.com/office/drawing/2015/9/8/chartex" xmlns:cx2="http://schemas.microsoft.com/office/drawing/2015/10/21/chartex" xmlns:cx3="http://schemas.microsoft.com/office/drawing/2016/5/9/chartex" xmlns:cx4="http://schemas.microsoft.com/office/drawing/2016/5/10/chartex" xmlns:cx5="http://schemas.microsoft.com/office/drawing/2016/5/11/chartex" xmlns:cx6="http://schemas.microsoft.com/office/drawing/2016/5/12/chartex" xmlns:cx7="http://schemas.microsoft.com/office/drawing/2016/5/13/chartex" xmlns:cx8="http://schemas.microsoft.com/office/drawing/2016/5/14/chartex" xmlns:mc="http://schemas.openxmlformats.org/markup-compatibility/2006" xmlns:aink="http://schemas.microsoft.com/office/drawing/2016/ink" xmlns:am3d="http://schemas.microsoft.com/office/drawing/2017/model3d" xmlns:o="urn:schemas-microsoft-com:office:office" xmlns:r="http://schemas.openxmlformats.org/officeDocument/2006/relationships" xmlns:m="http://schemas.openxmlformats.org/officeDocument/2006/math" xmlns:v="urn:schemas-microsoft-com:vml" xmlns:wp14="http://schemas.microsoft.com/office/word/2010/wordprocessingDrawing" xmlns:wp="http://schemas.openxmlformats.org/drawingml/2006/wordprocessingDrawing" xmlns:w10="urn:schemas-microsoft-com:office:word" xmlns:w="http://schemas.openxmlformats.org/wordprocessingml/2006/main" xmlns:w14="http://schemas.microsoft.com/office/word/2010/wordml" xmlns:w15="http://schemas.microsoft.com/office/word/2012/wordml" xmlns:w16cex="http://schemas.microsoft.com/office/word/2018/wordml/cex" xmlns:w16cid="http://schemas.microsoft.com/office/word/2016/wordml/cid" xmlns:w16="http://schemas.microsoft.com/office/word/2018/wordml" xmlns:w16sdtdh="http://schemas.microsoft.com/office/word/2020/wordml/sdtdatahash" xmlns:w16se="http://schemas.microsoft.com/office/word/2015/wordml/symex" xmlns:wpg="http://schemas.microsoft.com/office/word/2010/wordprocessingGroup" xmlns:wpi="http://schemas.microsoft.com/office/word/2010/wordprocessingInk" xmlns:wne="http://schemas.microsoft.com/office/word/2006/wordml" xmlns:wps="http://schemas.microsoft.com/office/word/2010/wordprocessingShape" mc:Ignorable="w14 w15 w16se w16cid w16 w16cex w16sdtdh wp14">
   <w:footnote w:type="separator" w:id="-1">
     <w:p>
       <w:r>
@@ -3564,7 +3786,7 @@
 </file>
 
 <file path=word/header1.xml><?xml version="1.0" encoding="utf-8"?>
-<w:hdr xmlns:wpc="http://schemas.microsoft.com/office/word/2010/wordprocessingCanvas" xmlns:cx="http://schemas.microsoft.com/office/drawing/2014/chartex" xmlns:cx1="http://schemas.microsoft.com/office/drawing/2015/9/8/chartex" xmlns:cx2="http://schemas.microsoft.com/office/drawing/2015/10/21/chartex" xmlns:cx3="http://schemas.microsoft.com/office/drawing/2016/5/9/chartex" xmlns:cx4="http://schemas.microsoft.com/office/drawing/2016/5/10/chartex" xmlns:cx5="http://schemas.microsoft.com/office/drawing/2016/5/11/chartex" xmlns:cx6="http://schemas.microsoft.com/office/drawing/2016/5/12/chartex" xmlns:cx7="http://schemas.microsoft.com/office/drawing/2016/5/13/chartex" xmlns:cx8="http://schemas.microsoft.com/office/drawing/2016/5/14/chartex" xmlns:mc="http://schemas.openxmlformats.org/markup-compatibility/2006" xmlns:aink="http://schemas.microsoft.com/office/drawing/2016/ink" xmlns:am3d="http://schemas.microsoft.com/office/drawing/2017/model3d" xmlns:o="urn:schemas-microsoft-com:office:office" xmlns:oel="http://schemas.microsoft.com/office/2019/extlst" xmlns:r="http://schemas.openxmlformats.org/officeDocument/2006/relationships" xmlns:m="http://schemas.openxmlformats.org/officeDocument/2006/math" xmlns:v="urn:schemas-microsoft-com:vml" xmlns:wp14="http://schemas.microsoft.com/office/word/2010/wordprocessingDrawing" xmlns:wp="http://schemas.openxmlformats.org/drawingml/2006/wordprocessingDrawing" xmlns:w10="urn:schemas-microsoft-com:office:word" xmlns:w="http://schemas.openxmlformats.org/wordprocessingml/2006/main" xmlns:w14="http://schemas.microsoft.com/office/word/2010/wordml" xmlns:w15="http://schemas.microsoft.com/office/word/2012/wordml" xmlns:w16cex="http://schemas.microsoft.com/office/word/2018/wordml/cex" xmlns:w16cid="http://schemas.microsoft.com/office/word/2016/wordml/cid" xmlns:w16="http://schemas.microsoft.com/office/word/2018/wordml" xmlns:w16du="http://schemas.microsoft.com/office/word/2023/wordml/word16du" xmlns:w16sdtdh="http://schemas.microsoft.com/office/word/2020/wordml/sdtdatahash" xmlns:w16sdtfl="http://schemas.microsoft.com/office/word/2024/wordml/sdtformatlock" xmlns:w16se="http://schemas.microsoft.com/office/word/2015/wordml/symex" xmlns:wpg="http://schemas.microsoft.com/office/word/2010/wordprocessingGroup" xmlns:wpi="http://schemas.microsoft.com/office/word/2010/wordprocessingInk" xmlns:wne="http://schemas.microsoft.com/office/word/2006/wordml" xmlns:wps="http://schemas.microsoft.com/office/word/2010/wordprocessingShape" xmlns:a="http://schemas.openxmlformats.org/drawingml/2006/main" xmlns:pic="http://schemas.openxmlformats.org/drawingml/2006/picture" xmlns:a14="http://schemas.microsoft.com/office/drawing/2010/main" mc:Ignorable="w14 w15 w16se w16cid w16 w16cex w16sdtdh w16sdtfl w16du wp14">
+<w:hdr xmlns:wpc="http://schemas.microsoft.com/office/word/2010/wordprocessingCanvas" xmlns:cx="http://schemas.microsoft.com/office/drawing/2014/chartex" xmlns:cx1="http://schemas.microsoft.com/office/drawing/2015/9/8/chartex" xmlns:cx2="http://schemas.microsoft.com/office/drawing/2015/10/21/chartex" xmlns:cx3="http://schemas.microsoft.com/office/drawing/2016/5/9/chartex" xmlns:cx4="http://schemas.microsoft.com/office/drawing/2016/5/10/chartex" xmlns:cx5="http://schemas.microsoft.com/office/drawing/2016/5/11/chartex" xmlns:cx6="http://schemas.microsoft.com/office/drawing/2016/5/12/chartex" xmlns:cx7="http://schemas.microsoft.com/office/drawing/2016/5/13/chartex" xmlns:cx8="http://schemas.microsoft.com/office/drawing/2016/5/14/chartex" xmlns:mc="http://schemas.openxmlformats.org/markup-compatibility/2006" xmlns:aink="http://schemas.microsoft.com/office/drawing/2016/ink" xmlns:am3d="http://schemas.microsoft.com/office/drawing/2017/model3d" xmlns:o="urn:schemas-microsoft-com:office:office" xmlns:r="http://schemas.openxmlformats.org/officeDocument/2006/relationships" xmlns:m="http://schemas.openxmlformats.org/officeDocument/2006/math" xmlns:v="urn:schemas-microsoft-com:vml" xmlns:wp14="http://schemas.microsoft.com/office/word/2010/wordprocessingDrawing" xmlns:wp="http://schemas.openxmlformats.org/drawingml/2006/wordprocessingDrawing" xmlns:w10="urn:schemas-microsoft-com:office:word" xmlns:w="http://schemas.openxmlformats.org/wordprocessingml/2006/main" xmlns:w14="http://schemas.microsoft.com/office/word/2010/wordml" xmlns:w15="http://schemas.microsoft.com/office/word/2012/wordml" xmlns:w16cex="http://schemas.microsoft.com/office/word/2018/wordml/cex" xmlns:w16cid="http://schemas.microsoft.com/office/word/2016/wordml/cid" xmlns:w16="http://schemas.microsoft.com/office/word/2018/wordml" xmlns:w16sdtdh="http://schemas.microsoft.com/office/word/2020/wordml/sdtdatahash" xmlns:w16se="http://schemas.microsoft.com/office/word/2015/wordml/symex" xmlns:wpg="http://schemas.microsoft.com/office/word/2010/wordprocessingGroup" xmlns:wpi="http://schemas.microsoft.com/office/word/2010/wordprocessingInk" xmlns:wne="http://schemas.microsoft.com/office/word/2006/wordml" xmlns:wps="http://schemas.microsoft.com/office/word/2010/wordprocessingShape" mc:Ignorable="w14 w15 w16se w16cid w16 w16cex w16sdtdh wp14">
   <w:p>
     <w:pPr>
       <w:pStyle w:val="Cabealho"/>
@@ -3676,7 +3898,7 @@
 </file>
 
 <file path=word/header2.xml><?xml version="1.0" encoding="utf-8"?>
-<w:hdr xmlns:wpc="http://schemas.microsoft.com/office/word/2010/wordprocessingCanvas" xmlns:cx="http://schemas.microsoft.com/office/drawing/2014/chartex" xmlns:cx1="http://schemas.microsoft.com/office/drawing/2015/9/8/chartex" xmlns:cx2="http://schemas.microsoft.com/office/drawing/2015/10/21/chartex" xmlns:cx3="http://schemas.microsoft.com/office/drawing/2016/5/9/chartex" xmlns:cx4="http://schemas.microsoft.com/office/drawing/2016/5/10/chartex" xmlns:cx5="http://schemas.microsoft.com/office/drawing/2016/5/11/chartex" xmlns:cx6="http://schemas.microsoft.com/office/drawing/2016/5/12/chartex" xmlns:cx7="http://schemas.microsoft.com/office/drawing/2016/5/13/chartex" xmlns:cx8="http://schemas.microsoft.com/office/drawing/2016/5/14/chartex" xmlns:mc="http://schemas.openxmlformats.org/markup-compatibility/2006" xmlns:aink="http://schemas.microsoft.com/office/drawing/2016/ink" xmlns:am3d="http://schemas.microsoft.com/office/drawing/2017/model3d" xmlns:o="urn:schemas-microsoft-com:office:office" xmlns:oel="http://schemas.microsoft.com/office/2019/extlst" xmlns:r="http://schemas.openxmlformats.org/officeDocument/2006/relationships" xmlns:m="http://schemas.openxmlformats.org/officeDocument/2006/math" xmlns:v="urn:schemas-microsoft-com:vml" xmlns:wp14="http://schemas.microsoft.com/office/word/2010/wordprocessingDrawing" xmlns:wp="http://schemas.openxmlformats.org/drawingml/2006/wordprocessingDrawing" xmlns:w10="urn:schemas-microsoft-com:office:word" xmlns:w="http://schemas.openxmlformats.org/wordprocessingml/2006/main" xmlns:w14="http://schemas.microsoft.com/office/word/2010/wordml" xmlns:w15="http://schemas.microsoft.com/office/word/2012/wordml" xmlns:w16cex="http://schemas.microsoft.com/office/word/2018/wordml/cex" xmlns:w16cid="http://schemas.microsoft.com/office/word/2016/wordml/cid" xmlns:w16="http://schemas.microsoft.com/office/word/2018/wordml" xmlns:w16du="http://schemas.microsoft.com/office/word/2023/wordml/word16du" xmlns:w16sdtdh="http://schemas.microsoft.com/office/word/2020/wordml/sdtdatahash" xmlns:w16sdtfl="http://schemas.microsoft.com/office/word/2024/wordml/sdtformatlock" xmlns:w16se="http://schemas.microsoft.com/office/word/2015/wordml/symex" xmlns:wpg="http://schemas.microsoft.com/office/word/2010/wordprocessingGroup" xmlns:wpi="http://schemas.microsoft.com/office/word/2010/wordprocessingInk" xmlns:wne="http://schemas.microsoft.com/office/word/2006/wordml" xmlns:wps="http://schemas.microsoft.com/office/word/2010/wordprocessingShape" xmlns:a="http://schemas.openxmlformats.org/drawingml/2006/main" xmlns:pic="http://schemas.openxmlformats.org/drawingml/2006/picture" xmlns:a14="http://schemas.microsoft.com/office/drawing/2010/main" mc:Ignorable="w14 w15 w16se w16cid w16 w16cex w16sdtdh w16sdtfl w16du wp14">
+<w:hdr xmlns:wpc="http://schemas.microsoft.com/office/word/2010/wordprocessingCanvas" xmlns:cx="http://schemas.microsoft.com/office/drawing/2014/chartex" xmlns:cx1="http://schemas.microsoft.com/office/drawing/2015/9/8/chartex" xmlns:cx2="http://schemas.microsoft.com/office/drawing/2015/10/21/chartex" xmlns:cx3="http://schemas.microsoft.com/office/drawing/2016/5/9/chartex" xmlns:cx4="http://schemas.microsoft.com/office/drawing/2016/5/10/chartex" xmlns:cx5="http://schemas.microsoft.com/office/drawing/2016/5/11/chartex" xmlns:cx6="http://schemas.microsoft.com/office/drawing/2016/5/12/chartex" xmlns:cx7="http://schemas.microsoft.com/office/drawing/2016/5/13/chartex" xmlns:cx8="http://schemas.microsoft.com/office/drawing/2016/5/14/chartex" xmlns:mc="http://schemas.openxmlformats.org/markup-compatibility/2006" xmlns:aink="http://schemas.microsoft.com/office/drawing/2016/ink" xmlns:am3d="http://schemas.microsoft.com/office/drawing/2017/model3d" xmlns:o="urn:schemas-microsoft-com:office:office" xmlns:r="http://schemas.openxmlformats.org/officeDocument/2006/relationships" xmlns:m="http://schemas.openxmlformats.org/officeDocument/2006/math" xmlns:v="urn:schemas-microsoft-com:vml" xmlns:wp14="http://schemas.microsoft.com/office/word/2010/wordprocessingDrawing" xmlns:wp="http://schemas.openxmlformats.org/drawingml/2006/wordprocessingDrawing" xmlns:w10="urn:schemas-microsoft-com:office:word" xmlns:w="http://schemas.openxmlformats.org/wordprocessingml/2006/main" xmlns:w14="http://schemas.microsoft.com/office/word/2010/wordml" xmlns:w15="http://schemas.microsoft.com/office/word/2012/wordml" xmlns:w16cex="http://schemas.microsoft.com/office/word/2018/wordml/cex" xmlns:w16cid="http://schemas.microsoft.com/office/word/2016/wordml/cid" xmlns:w16="http://schemas.microsoft.com/office/word/2018/wordml" xmlns:w16sdtdh="http://schemas.microsoft.com/office/word/2020/wordml/sdtdatahash" xmlns:w16se="http://schemas.microsoft.com/office/word/2015/wordml/symex" xmlns:wpg="http://schemas.microsoft.com/office/word/2010/wordprocessingGroup" xmlns:wpi="http://schemas.microsoft.com/office/word/2010/wordprocessingInk" xmlns:wne="http://schemas.microsoft.com/office/word/2006/wordml" xmlns:wps="http://schemas.microsoft.com/office/word/2010/wordprocessingShape" mc:Ignorable="w14 w15 w16se w16cid w16 w16cex w16sdtdh wp14">
   <w:p>
     <w:pPr>
       <w:pStyle w:val="Cabealho"/>
@@ -3804,183 +4026,7 @@
 </file>
 
 <file path=word/numbering.xml><?xml version="1.0" encoding="utf-8"?>
-<w:numbering xmlns:wpc="http://schemas.microsoft.com/office/word/2010/wordprocessingCanvas" xmlns:cx="http://schemas.microsoft.com/office/drawing/2014/chartex" xmlns:cx1="http://schemas.microsoft.com/office/drawing/2015/9/8/chartex" xmlns:cx2="http://schemas.microsoft.com/office/drawing/2015/10/21/chartex" xmlns:cx3="http://schemas.microsoft.com/office/drawing/2016/5/9/chartex" xmlns:cx4="http://schemas.microsoft.com/office/drawing/2016/5/10/chartex" xmlns:cx5="http://schemas.microsoft.com/office/drawing/2016/5/11/chartex" xmlns:cx6="http://schemas.microsoft.com/office/drawing/2016/5/12/chartex" xmlns:cx7="http://schemas.microsoft.com/office/drawing/2016/5/13/chartex" xmlns:cx8="http://schemas.microsoft.com/office/drawing/2016/5/14/chartex" xmlns:mc="http://schemas.openxmlformats.org/markup-compatibility/2006" xmlns:aink="http://schemas.microsoft.com/office/drawing/2016/ink" xmlns:am3d="http://schemas.microsoft.com/office/drawing/2017/model3d" xmlns:o="urn:schemas-microsoft-com:office:office" xmlns:oel="http://schemas.microsoft.com/office/2019/extlst" xmlns:r="http://schemas.openxmlformats.org/officeDocument/2006/relationships" xmlns:m="http://schemas.openxmlformats.org/officeDocument/2006/math" xmlns:v="urn:schemas-microsoft-com:vml" xmlns:wp14="http://schemas.microsoft.com/office/word/2010/wordprocessingDrawing" xmlns:wp="http://schemas.openxmlformats.org/drawingml/2006/wordprocessingDrawing" xmlns:w10="urn:schemas-microsoft-com:office:word" xmlns:w="http://schemas.openxmlformats.org/wordprocessingml/2006/main" xmlns:w14="http://schemas.microsoft.com/office/word/2010/wordml" xmlns:w15="http://schemas.microsoft.com/office/word/2012/wordml" xmlns:w16cex="http://schemas.microsoft.com/office/word/2018/wordml/cex" xmlns:w16cid="http://schemas.microsoft.com/office/word/2016/wordml/cid" xmlns:w16="http://schemas.microsoft.com/office/word/2018/wordml" xmlns:w16du="http://schemas.microsoft.com/office/word/2023/wordml/word16du" xmlns:w16sdtdh="http://schemas.microsoft.com/office/word/2020/wordml/sdtdatahash" xmlns:w16sdtfl="http://schemas.microsoft.com/office/word/2024/wordml/sdtformatlock" xmlns:w16se="http://schemas.microsoft.com/office/word/2015/wordml/symex" xmlns:wpg="http://schemas.microsoft.com/office/word/2010/wordprocessingGroup" xmlns:wpi="http://schemas.microsoft.com/office/word/2010/wordprocessingInk" xmlns:wne="http://schemas.microsoft.com/office/word/2006/wordml" xmlns:wps="http://schemas.microsoft.com/office/word/2010/wordprocessingShape" mc:Ignorable="w14 w15 w16se w16cid w16 w16cex w16sdtdh w16sdtfl w16du wp14">
-  <w:abstractNum xmlns:w="http://schemas.openxmlformats.org/wordprocessingml/2006/main" w:abstractNumId="5">
-    <w:nsid w:val="5c2159a9"/>
-    <w:multiLevelType xmlns:w="http://schemas.openxmlformats.org/wordprocessingml/2006/main" w:val="hybridMultilevel"/>
-    <w:lvl xmlns:w="http://schemas.openxmlformats.org/wordprocessingml/2006/main" w:ilvl="0">
-      <w:start w:val="2"/>
-      <w:numFmt w:val="decimal"/>
-      <w:lvlText w:val="%1."/>
-      <w:lvlJc w:val="left"/>
-      <w:pPr>
-        <w:ind w:left="747" w:hanging="357"/>
-      </w:pPr>
-      <w:rPr>
-        <w:rFonts w:hint="default" w:ascii="Arial Narrow" w:hAnsi="Arial Narrow"/>
-      </w:rPr>
-    </w:lvl>
-    <w:lvl xmlns:w="http://schemas.openxmlformats.org/wordprocessingml/2006/main" w:ilvl="1">
-      <w:start w:val="1"/>
-      <w:numFmt w:val="lowerLetter"/>
-      <w:lvlText w:val="%2."/>
-      <w:lvlJc w:val="left"/>
-      <w:pPr>
-        <w:ind w:left="1789" w:hanging="360"/>
-      </w:pPr>
-    </w:lvl>
-    <w:lvl xmlns:w="http://schemas.openxmlformats.org/wordprocessingml/2006/main" w:ilvl="2">
-      <w:start w:val="1"/>
-      <w:numFmt w:val="lowerRoman"/>
-      <w:lvlText w:val="%3."/>
-      <w:lvlJc w:val="right"/>
-      <w:pPr>
-        <w:ind w:left="2509" w:hanging="180"/>
-      </w:pPr>
-    </w:lvl>
-    <w:lvl xmlns:w="http://schemas.openxmlformats.org/wordprocessingml/2006/main" w:ilvl="3">
-      <w:start w:val="1"/>
-      <w:numFmt w:val="decimal"/>
-      <w:lvlText w:val="%4."/>
-      <w:lvlJc w:val="left"/>
-      <w:pPr>
-        <w:ind w:left="3229" w:hanging="360"/>
-      </w:pPr>
-    </w:lvl>
-    <w:lvl xmlns:w="http://schemas.openxmlformats.org/wordprocessingml/2006/main" w:ilvl="4">
-      <w:start w:val="1"/>
-      <w:numFmt w:val="lowerLetter"/>
-      <w:lvlText w:val="%5."/>
-      <w:lvlJc w:val="left"/>
-      <w:pPr>
-        <w:ind w:left="3949" w:hanging="360"/>
-      </w:pPr>
-    </w:lvl>
-    <w:lvl xmlns:w="http://schemas.openxmlformats.org/wordprocessingml/2006/main" w:ilvl="5">
-      <w:start w:val="1"/>
-      <w:numFmt w:val="lowerRoman"/>
-      <w:lvlText w:val="%6."/>
-      <w:lvlJc w:val="right"/>
-      <w:pPr>
-        <w:ind w:left="4669" w:hanging="180"/>
-      </w:pPr>
-    </w:lvl>
-    <w:lvl xmlns:w="http://schemas.openxmlformats.org/wordprocessingml/2006/main" w:ilvl="6">
-      <w:start w:val="1"/>
-      <w:numFmt w:val="decimal"/>
-      <w:lvlText w:val="%7."/>
-      <w:lvlJc w:val="left"/>
-      <w:pPr>
-        <w:ind w:left="5389" w:hanging="360"/>
-      </w:pPr>
-    </w:lvl>
-    <w:lvl xmlns:w="http://schemas.openxmlformats.org/wordprocessingml/2006/main" w:ilvl="7">
-      <w:start w:val="1"/>
-      <w:numFmt w:val="lowerLetter"/>
-      <w:lvlText w:val="%8."/>
-      <w:lvlJc w:val="left"/>
-      <w:pPr>
-        <w:ind w:left="6109" w:hanging="360"/>
-      </w:pPr>
-    </w:lvl>
-    <w:lvl xmlns:w="http://schemas.openxmlformats.org/wordprocessingml/2006/main" w:ilvl="8">
-      <w:start w:val="1"/>
-      <w:numFmt w:val="lowerRoman"/>
-      <w:lvlText w:val="%9."/>
-      <w:lvlJc w:val="right"/>
-      <w:pPr>
-        <w:ind w:left="6829" w:hanging="180"/>
-      </w:pPr>
-    </w:lvl>
-  </w:abstractNum>
-  <w:abstractNum xmlns:w="http://schemas.openxmlformats.org/wordprocessingml/2006/main" w:abstractNumId="4">
-    <w:nsid w:val="6ea37811"/>
-    <w:multiLevelType xmlns:w="http://schemas.openxmlformats.org/wordprocessingml/2006/main" w:val="hybridMultilevel"/>
-    <w:lvl xmlns:w="http://schemas.openxmlformats.org/wordprocessingml/2006/main" w:ilvl="0">
-      <w:start w:val="2"/>
-      <w:numFmt w:val="decimal"/>
-      <w:lvlText w:val="%1."/>
-      <w:lvlJc w:val="left"/>
-      <w:pPr>
-        <w:ind w:left="747" w:hanging="357"/>
-      </w:pPr>
-      <w:rPr>
-        <w:rFonts w:hint="default" w:ascii="Arial Narrow" w:hAnsi="Arial Narrow"/>
-      </w:rPr>
-    </w:lvl>
-    <w:lvl xmlns:w="http://schemas.openxmlformats.org/wordprocessingml/2006/main" w:ilvl="1">
-      <w:start w:val="1"/>
-      <w:numFmt w:val="lowerLetter"/>
-      <w:lvlText w:val="%2."/>
-      <w:lvlJc w:val="left"/>
-      <w:pPr>
-        <w:ind w:left="1789" w:hanging="360"/>
-      </w:pPr>
-    </w:lvl>
-    <w:lvl xmlns:w="http://schemas.openxmlformats.org/wordprocessingml/2006/main" w:ilvl="2">
-      <w:start w:val="1"/>
-      <w:numFmt w:val="lowerRoman"/>
-      <w:lvlText w:val="%3."/>
-      <w:lvlJc w:val="right"/>
-      <w:pPr>
-        <w:ind w:left="2509" w:hanging="180"/>
-      </w:pPr>
-    </w:lvl>
-    <w:lvl xmlns:w="http://schemas.openxmlformats.org/wordprocessingml/2006/main" w:ilvl="3">
-      <w:start w:val="1"/>
-      <w:numFmt w:val="decimal"/>
-      <w:lvlText w:val="%4."/>
-      <w:lvlJc w:val="left"/>
-      <w:pPr>
-        <w:ind w:left="3229" w:hanging="360"/>
-      </w:pPr>
-    </w:lvl>
-    <w:lvl xmlns:w="http://schemas.openxmlformats.org/wordprocessingml/2006/main" w:ilvl="4">
-      <w:start w:val="1"/>
-      <w:numFmt w:val="lowerLetter"/>
-      <w:lvlText w:val="%5."/>
-      <w:lvlJc w:val="left"/>
-      <w:pPr>
-        <w:ind w:left="3949" w:hanging="360"/>
-      </w:pPr>
-    </w:lvl>
-    <w:lvl xmlns:w="http://schemas.openxmlformats.org/wordprocessingml/2006/main" w:ilvl="5">
-      <w:start w:val="1"/>
-      <w:numFmt w:val="lowerRoman"/>
-      <w:lvlText w:val="%6."/>
-      <w:lvlJc w:val="right"/>
-      <w:pPr>
-        <w:ind w:left="4669" w:hanging="180"/>
-      </w:pPr>
-    </w:lvl>
-    <w:lvl xmlns:w="http://schemas.openxmlformats.org/wordprocessingml/2006/main" w:ilvl="6">
-      <w:start w:val="1"/>
-      <w:numFmt w:val="decimal"/>
-      <w:lvlText w:val="%7."/>
-      <w:lvlJc w:val="left"/>
-      <w:pPr>
-        <w:ind w:left="5389" w:hanging="360"/>
-      </w:pPr>
-    </w:lvl>
-    <w:lvl xmlns:w="http://schemas.openxmlformats.org/wordprocessingml/2006/main" w:ilvl="7">
-      <w:start w:val="1"/>
-      <w:numFmt w:val="lowerLetter"/>
-      <w:lvlText w:val="%8."/>
-      <w:lvlJc w:val="left"/>
-      <w:pPr>
-        <w:ind w:left="6109" w:hanging="360"/>
-      </w:pPr>
-    </w:lvl>
-    <w:lvl xmlns:w="http://schemas.openxmlformats.org/wordprocessingml/2006/main" w:ilvl="8">
-      <w:start w:val="1"/>
-      <w:numFmt w:val="lowerRoman"/>
-      <w:lvlText w:val="%9."/>
-      <w:lvlJc w:val="right"/>
-      <w:pPr>
-        <w:ind w:left="6829" w:hanging="180"/>
-      </w:pPr>
-    </w:lvl>
-  </w:abstractNum>
+<w:numbering xmlns:wpc="http://schemas.microsoft.com/office/word/2010/wordprocessingCanvas" xmlns:cx="http://schemas.microsoft.com/office/drawing/2014/chartex" xmlns:cx1="http://schemas.microsoft.com/office/drawing/2015/9/8/chartex" xmlns:cx2="http://schemas.microsoft.com/office/drawing/2015/10/21/chartex" xmlns:cx3="http://schemas.microsoft.com/office/drawing/2016/5/9/chartex" xmlns:cx4="http://schemas.microsoft.com/office/drawing/2016/5/10/chartex" xmlns:cx5="http://schemas.microsoft.com/office/drawing/2016/5/11/chartex" xmlns:cx6="http://schemas.microsoft.com/office/drawing/2016/5/12/chartex" xmlns:cx7="http://schemas.microsoft.com/office/drawing/2016/5/13/chartex" xmlns:cx8="http://schemas.microsoft.com/office/drawing/2016/5/14/chartex" xmlns:mc="http://schemas.openxmlformats.org/markup-compatibility/2006" xmlns:aink="http://schemas.microsoft.com/office/drawing/2016/ink" xmlns:am3d="http://schemas.microsoft.com/office/drawing/2017/model3d" xmlns:o="urn:schemas-microsoft-com:office:office" xmlns:r="http://schemas.openxmlformats.org/officeDocument/2006/relationships" xmlns:m="http://schemas.openxmlformats.org/officeDocument/2006/math" xmlns:v="urn:schemas-microsoft-com:vml" xmlns:wp14="http://schemas.microsoft.com/office/word/2010/wordprocessingDrawing" xmlns:wp="http://schemas.openxmlformats.org/drawingml/2006/wordprocessingDrawing" xmlns:w10="urn:schemas-microsoft-com:office:word" xmlns:w="http://schemas.openxmlformats.org/wordprocessingml/2006/main" xmlns:w14="http://schemas.microsoft.com/office/word/2010/wordml" xmlns:w15="http://schemas.microsoft.com/office/word/2012/wordml" xmlns:w16cex="http://schemas.microsoft.com/office/word/2018/wordml/cex" xmlns:w16cid="http://schemas.microsoft.com/office/word/2016/wordml/cid" xmlns:w16="http://schemas.microsoft.com/office/word/2018/wordml" xmlns:w16sdtdh="http://schemas.microsoft.com/office/word/2020/wordml/sdtdatahash" xmlns:w16se="http://schemas.microsoft.com/office/word/2015/wordml/symex" xmlns:wpg="http://schemas.microsoft.com/office/word/2010/wordprocessingGroup" xmlns:wpi="http://schemas.microsoft.com/office/word/2010/wordprocessingInk" xmlns:wne="http://schemas.microsoft.com/office/word/2006/wordml" xmlns:wps="http://schemas.microsoft.com/office/word/2010/wordprocessingShape" mc:Ignorable="w14 w15 w16se w16cid w16 w16cex w16sdtdh wp14">
   <w:abstractNum w:abstractNumId="0" w15:restartNumberingAfterBreak="0">
     <w:nsid w:val="0BBB417D"/>
     <w:multiLevelType w:val="hybridMultilevel"/>
@@ -3994,7 +4040,7 @@
         <w:ind w:left="1467" w:hanging="360"/>
       </w:pPr>
       <w:rPr>
-        <w:rFonts w:hint="default" w:ascii="Symbol" w:hAnsi="Symbol"/>
+        <w:rFonts w:ascii="Symbol" w:hAnsi="Symbol" w:hint="default"/>
       </w:rPr>
     </w:lvl>
     <w:lvl w:ilvl="1" w:tplc="04160003" w:tentative="1">
@@ -4006,7 +4052,7 @@
         <w:ind w:left="2187" w:hanging="360"/>
       </w:pPr>
       <w:rPr>
-        <w:rFonts w:hint="default" w:ascii="Courier New" w:hAnsi="Courier New" w:cs="Courier New"/>
+        <w:rFonts w:ascii="Courier New" w:hAnsi="Courier New" w:cs="Courier New" w:hint="default"/>
       </w:rPr>
     </w:lvl>
     <w:lvl w:ilvl="2" w:tplc="04160005" w:tentative="1">
@@ -4018,7 +4064,7 @@
         <w:ind w:left="2907" w:hanging="360"/>
       </w:pPr>
       <w:rPr>
-        <w:rFonts w:hint="default" w:ascii="Wingdings" w:hAnsi="Wingdings"/>
+        <w:rFonts w:ascii="Wingdings" w:hAnsi="Wingdings" w:hint="default"/>
       </w:rPr>
     </w:lvl>
     <w:lvl w:ilvl="3" w:tplc="04160001" w:tentative="1">
@@ -4030,7 +4076,7 @@
         <w:ind w:left="3627" w:hanging="360"/>
       </w:pPr>
       <w:rPr>
-        <w:rFonts w:hint="default" w:ascii="Symbol" w:hAnsi="Symbol"/>
+        <w:rFonts w:ascii="Symbol" w:hAnsi="Symbol" w:hint="default"/>
       </w:rPr>
     </w:lvl>
     <w:lvl w:ilvl="4" w:tplc="04160003" w:tentative="1">
@@ -4042,7 +4088,7 @@
         <w:ind w:left="4347" w:hanging="360"/>
       </w:pPr>
       <w:rPr>
-        <w:rFonts w:hint="default" w:ascii="Courier New" w:hAnsi="Courier New" w:cs="Courier New"/>
+        <w:rFonts w:ascii="Courier New" w:hAnsi="Courier New" w:cs="Courier New" w:hint="default"/>
       </w:rPr>
     </w:lvl>
     <w:lvl w:ilvl="5" w:tplc="04160005" w:tentative="1">
@@ -4054,7 +4100,7 @@
         <w:ind w:left="5067" w:hanging="360"/>
       </w:pPr>
       <w:rPr>
-        <w:rFonts w:hint="default" w:ascii="Wingdings" w:hAnsi="Wingdings"/>
+        <w:rFonts w:ascii="Wingdings" w:hAnsi="Wingdings" w:hint="default"/>
       </w:rPr>
     </w:lvl>
     <w:lvl w:ilvl="6" w:tplc="04160001" w:tentative="1">
@@ -4066,7 +4112,7 @@
         <w:ind w:left="5787" w:hanging="360"/>
       </w:pPr>
       <w:rPr>
-        <w:rFonts w:hint="default" w:ascii="Symbol" w:hAnsi="Symbol"/>
+        <w:rFonts w:ascii="Symbol" w:hAnsi="Symbol" w:hint="default"/>
       </w:rPr>
     </w:lvl>
     <w:lvl w:ilvl="7" w:tplc="04160003" w:tentative="1">
@@ -4078,7 +4124,7 @@
         <w:ind w:left="6507" w:hanging="360"/>
       </w:pPr>
       <w:rPr>
-        <w:rFonts w:hint="default" w:ascii="Courier New" w:hAnsi="Courier New" w:cs="Courier New"/>
+        <w:rFonts w:ascii="Courier New" w:hAnsi="Courier New" w:cs="Courier New" w:hint="default"/>
       </w:rPr>
     </w:lvl>
     <w:lvl w:ilvl="8" w:tplc="04160005" w:tentative="1">
@@ -4090,7 +4136,7 @@
         <w:ind w:left="7227" w:hanging="360"/>
       </w:pPr>
       <w:rPr>
-        <w:rFonts w:hint="default" w:ascii="Wingdings" w:hAnsi="Wingdings"/>
+        <w:rFonts w:ascii="Wingdings" w:hAnsi="Wingdings" w:hint="default"/>
       </w:rPr>
     </w:lvl>
   </w:abstractNum>
@@ -4107,7 +4153,7 @@
         <w:ind w:left="747" w:hanging="357"/>
       </w:pPr>
       <w:rPr>
-        <w:rFonts w:hint="default" w:ascii="Arial Narrow" w:hAnsi="Arial Narrow" w:eastAsia="Arial Narrow" w:cs="Arial Narrow"/>
+        <w:rFonts w:ascii="Arial Narrow" w:eastAsia="Arial Narrow" w:hAnsi="Arial Narrow" w:cs="Arial Narrow" w:hint="default"/>
         <w:b/>
         <w:bCs/>
         <w:spacing w:val="-2"/>
@@ -4218,7 +4264,7 @@
     <w:nsid w:val="525E33F7"/>
     <w:multiLevelType w:val="hybridMultilevel"/>
     <w:tmpl w:val="AAC26548"/>
-    <w:lvl w:ilvl="0">
+    <w:lvl w:ilvl="0" w:tplc="FFFFFFFF">
       <w:start w:val="2"/>
       <w:numFmt w:val="decimal"/>
       <w:lvlText w:val="%1."/>
@@ -4227,7 +4273,7 @@
         <w:ind w:left="747" w:hanging="357"/>
       </w:pPr>
       <w:rPr>
-        <w:rFonts w:hint="default" w:ascii="Arial Narrow" w:hAnsi="Arial Narrow"/>
+        <w:rFonts w:ascii="Arial Narrow" w:hAnsi="Arial Narrow" w:hint="default"/>
         <w:b/>
         <w:bCs/>
         <w:spacing w:val="-2"/>
@@ -4335,6 +4381,184 @@
     </w:lvl>
   </w:abstractNum>
   <w:abstractNum w:abstractNumId="3" w15:restartNumberingAfterBreak="0">
+    <w:nsid w:val="5C2159A9"/>
+    <w:multiLevelType w:val="hybridMultilevel"/>
+    <w:tmpl w:val="067AC1FC"/>
+    <w:lvl w:ilvl="0" w:tplc="85E2CDCC">
+      <w:start w:val="2"/>
+      <w:numFmt w:val="decimal"/>
+      <w:lvlText w:val="%1."/>
+      <w:lvlJc w:val="left"/>
+      <w:pPr>
+        <w:ind w:left="747" w:hanging="357"/>
+      </w:pPr>
+      <w:rPr>
+        <w:rFonts w:ascii="Arial Narrow" w:hAnsi="Arial Narrow" w:hint="default"/>
+      </w:rPr>
+    </w:lvl>
+    <w:lvl w:ilvl="1" w:tplc="A15E2544">
+      <w:start w:val="1"/>
+      <w:numFmt w:val="lowerLetter"/>
+      <w:lvlText w:val="%2."/>
+      <w:lvlJc w:val="left"/>
+      <w:pPr>
+        <w:ind w:left="1789" w:hanging="360"/>
+      </w:pPr>
+    </w:lvl>
+    <w:lvl w:ilvl="2" w:tplc="FD96EF22">
+      <w:start w:val="1"/>
+      <w:numFmt w:val="lowerRoman"/>
+      <w:lvlText w:val="%3."/>
+      <w:lvlJc w:val="right"/>
+      <w:pPr>
+        <w:ind w:left="2509" w:hanging="180"/>
+      </w:pPr>
+    </w:lvl>
+    <w:lvl w:ilvl="3" w:tplc="701A089A">
+      <w:start w:val="1"/>
+      <w:numFmt w:val="decimal"/>
+      <w:lvlText w:val="%4."/>
+      <w:lvlJc w:val="left"/>
+      <w:pPr>
+        <w:ind w:left="3229" w:hanging="360"/>
+      </w:pPr>
+    </w:lvl>
+    <w:lvl w:ilvl="4" w:tplc="63820FA6">
+      <w:start w:val="1"/>
+      <w:numFmt w:val="lowerLetter"/>
+      <w:lvlText w:val="%5."/>
+      <w:lvlJc w:val="left"/>
+      <w:pPr>
+        <w:ind w:left="3949" w:hanging="360"/>
+      </w:pPr>
+    </w:lvl>
+    <w:lvl w:ilvl="5" w:tplc="93EEAE34">
+      <w:start w:val="1"/>
+      <w:numFmt w:val="lowerRoman"/>
+      <w:lvlText w:val="%6."/>
+      <w:lvlJc w:val="right"/>
+      <w:pPr>
+        <w:ind w:left="4669" w:hanging="180"/>
+      </w:pPr>
+    </w:lvl>
+    <w:lvl w:ilvl="6" w:tplc="97E4A028">
+      <w:start w:val="1"/>
+      <w:numFmt w:val="decimal"/>
+      <w:lvlText w:val="%7."/>
+      <w:lvlJc w:val="left"/>
+      <w:pPr>
+        <w:ind w:left="5389" w:hanging="360"/>
+      </w:pPr>
+    </w:lvl>
+    <w:lvl w:ilvl="7" w:tplc="C4E29846">
+      <w:start w:val="1"/>
+      <w:numFmt w:val="lowerLetter"/>
+      <w:lvlText w:val="%8."/>
+      <w:lvlJc w:val="left"/>
+      <w:pPr>
+        <w:ind w:left="6109" w:hanging="360"/>
+      </w:pPr>
+    </w:lvl>
+    <w:lvl w:ilvl="8" w:tplc="3ED6F52E">
+      <w:start w:val="1"/>
+      <w:numFmt w:val="lowerRoman"/>
+      <w:lvlText w:val="%9."/>
+      <w:lvlJc w:val="right"/>
+      <w:pPr>
+        <w:ind w:left="6829" w:hanging="180"/>
+      </w:pPr>
+    </w:lvl>
+  </w:abstractNum>
+  <w:abstractNum w:abstractNumId="4" w15:restartNumberingAfterBreak="0">
+    <w:nsid w:val="6EA37811"/>
+    <w:multiLevelType w:val="hybridMultilevel"/>
+    <w:tmpl w:val="93DCD08A"/>
+    <w:lvl w:ilvl="0" w:tplc="E7AE9E72">
+      <w:start w:val="2"/>
+      <w:numFmt w:val="decimal"/>
+      <w:lvlText w:val="%1."/>
+      <w:lvlJc w:val="left"/>
+      <w:pPr>
+        <w:ind w:left="747" w:hanging="357"/>
+      </w:pPr>
+      <w:rPr>
+        <w:rFonts w:ascii="Arial Narrow" w:hAnsi="Arial Narrow" w:hint="default"/>
+      </w:rPr>
+    </w:lvl>
+    <w:lvl w:ilvl="1" w:tplc="F03A7B5C">
+      <w:start w:val="1"/>
+      <w:numFmt w:val="lowerLetter"/>
+      <w:lvlText w:val="%2."/>
+      <w:lvlJc w:val="left"/>
+      <w:pPr>
+        <w:ind w:left="1789" w:hanging="360"/>
+      </w:pPr>
+    </w:lvl>
+    <w:lvl w:ilvl="2" w:tplc="FEA81DD6">
+      <w:start w:val="1"/>
+      <w:numFmt w:val="lowerRoman"/>
+      <w:lvlText w:val="%3."/>
+      <w:lvlJc w:val="right"/>
+      <w:pPr>
+        <w:ind w:left="2509" w:hanging="180"/>
+      </w:pPr>
+    </w:lvl>
+    <w:lvl w:ilvl="3" w:tplc="F3A239EC">
+      <w:start w:val="1"/>
+      <w:numFmt w:val="decimal"/>
+      <w:lvlText w:val="%4."/>
+      <w:lvlJc w:val="left"/>
+      <w:pPr>
+        <w:ind w:left="3229" w:hanging="360"/>
+      </w:pPr>
+    </w:lvl>
+    <w:lvl w:ilvl="4" w:tplc="7702179E">
+      <w:start w:val="1"/>
+      <w:numFmt w:val="lowerLetter"/>
+      <w:lvlText w:val="%5."/>
+      <w:lvlJc w:val="left"/>
+      <w:pPr>
+        <w:ind w:left="3949" w:hanging="360"/>
+      </w:pPr>
+    </w:lvl>
+    <w:lvl w:ilvl="5" w:tplc="8832532E">
+      <w:start w:val="1"/>
+      <w:numFmt w:val="lowerRoman"/>
+      <w:lvlText w:val="%6."/>
+      <w:lvlJc w:val="right"/>
+      <w:pPr>
+        <w:ind w:left="4669" w:hanging="180"/>
+      </w:pPr>
+    </w:lvl>
+    <w:lvl w:ilvl="6" w:tplc="803CDF0C">
+      <w:start w:val="1"/>
+      <w:numFmt w:val="decimal"/>
+      <w:lvlText w:val="%7."/>
+      <w:lvlJc w:val="left"/>
+      <w:pPr>
+        <w:ind w:left="5389" w:hanging="360"/>
+      </w:pPr>
+    </w:lvl>
+    <w:lvl w:ilvl="7" w:tplc="73E6A140">
+      <w:start w:val="1"/>
+      <w:numFmt w:val="lowerLetter"/>
+      <w:lvlText w:val="%8."/>
+      <w:lvlJc w:val="left"/>
+      <w:pPr>
+        <w:ind w:left="6109" w:hanging="360"/>
+      </w:pPr>
+    </w:lvl>
+    <w:lvl w:ilvl="8" w:tplc="A5A66D44">
+      <w:start w:val="1"/>
+      <w:numFmt w:val="lowerRoman"/>
+      <w:lvlText w:val="%9."/>
+      <w:lvlJc w:val="right"/>
+      <w:pPr>
+        <w:ind w:left="6829" w:hanging="180"/>
+      </w:pPr>
+    </w:lvl>
+  </w:abstractNum>
+  <w:abstractNum w:abstractNumId="5" w15:restartNumberingAfterBreak="0">
     <w:nsid w:val="7D0168F9"/>
     <w:multiLevelType w:val="hybridMultilevel"/>
     <w:tmpl w:val="58E01E78"/>
@@ -4424,33 +4648,33 @@
       </w:pPr>
     </w:lvl>
   </w:abstractNum>
-  <w:num w:numId="6">
+  <w:num w:numId="1">
+    <w:abstractNumId w:val="3"/>
+  </w:num>
+  <w:num w:numId="2">
+    <w:abstractNumId w:val="4"/>
+  </w:num>
+  <w:num w:numId="3">
+    <w:abstractNumId w:val="1"/>
+  </w:num>
+  <w:num w:numId="4">
+    <w:abstractNumId w:val="2"/>
+  </w:num>
+  <w:num w:numId="5">
     <w:abstractNumId w:val="5"/>
   </w:num>
-  <w:num w:numId="5">
-    <w:abstractNumId w:val="4"/>
-  </w:num>
-  <w:num w:numId="1" w16cid:durableId="265816976">
-    <w:abstractNumId w:val="1"/>
-  </w:num>
-  <w:num w:numId="2" w16cid:durableId="84570851">
-    <w:abstractNumId w:val="2"/>
-  </w:num>
-  <w:num w:numId="3" w16cid:durableId="1881743039">
-    <w:abstractNumId w:val="3"/>
-  </w:num>
-  <w:num w:numId="4" w16cid:durableId="1373142863">
+  <w:num w:numId="6">
     <w:abstractNumId w:val="0"/>
   </w:num>
 </w:numbering>
 </file>
 
 <file path=word/styles.xml><?xml version="1.0" encoding="utf-8"?>
-<w:styles xmlns:mc="http://schemas.openxmlformats.org/markup-compatibility/2006" xmlns:r="http://schemas.openxmlformats.org/officeDocument/2006/relationships" xmlns:w="http://schemas.openxmlformats.org/wordprocessingml/2006/main" xmlns:w14="http://schemas.microsoft.com/office/word/2010/wordml" xmlns:w15="http://schemas.microsoft.com/office/word/2012/wordml" xmlns:w16cex="http://schemas.microsoft.com/office/word/2018/wordml/cex" xmlns:w16cid="http://schemas.microsoft.com/office/word/2016/wordml/cid" xmlns:w16="http://schemas.microsoft.com/office/word/2018/wordml" xmlns:w16du="http://schemas.microsoft.com/office/word/2023/wordml/word16du" xmlns:w16sdtdh="http://schemas.microsoft.com/office/word/2020/wordml/sdtdatahash" xmlns:w16sdtfl="http://schemas.microsoft.com/office/word/2024/wordml/sdtformatlock" xmlns:w16se="http://schemas.microsoft.com/office/word/2015/wordml/symex" mc:Ignorable="w14 w15 w16se w16cid w16 w16cex w16sdtdh w16sdtfl w16du">
+<w:styles xmlns:mc="http://schemas.openxmlformats.org/markup-compatibility/2006" xmlns:r="http://schemas.openxmlformats.org/officeDocument/2006/relationships" xmlns:w="http://schemas.openxmlformats.org/wordprocessingml/2006/main" xmlns:w14="http://schemas.microsoft.com/office/word/2010/wordml" xmlns:w15="http://schemas.microsoft.com/office/word/2012/wordml" xmlns:w16cex="http://schemas.microsoft.com/office/word/2018/wordml/cex" xmlns:w16cid="http://schemas.microsoft.com/office/word/2016/wordml/cid" xmlns:w16="http://schemas.microsoft.com/office/word/2018/wordml" xmlns:w16sdtdh="http://schemas.microsoft.com/office/word/2020/wordml/sdtdatahash" xmlns:w16se="http://schemas.microsoft.com/office/word/2015/wordml/symex" mc:Ignorable="w14 w15 w16se w16cid w16 w16cex w16sdtdh">
   <w:docDefaults>
     <w:rPrDefault>
       <w:rPr>
-        <w:rFonts w:asciiTheme="minorHAnsi" w:hAnsiTheme="minorHAnsi" w:eastAsiaTheme="minorHAnsi" w:cstheme="minorBidi"/>
+        <w:rFonts w:asciiTheme="minorHAnsi" w:eastAsiaTheme="minorHAnsi" w:hAnsiTheme="minorHAnsi" w:cstheme="minorBidi"/>
         <w:sz w:val="22"/>
         <w:szCs w:val="22"/>
         <w:lang w:val="en-US" w:eastAsia="en-US" w:bidi="ar-SA"/>
@@ -4467,14 +4691,14 @@
   <w:latentStyles w:defLockedState="0" w:defUIPriority="99" w:defSemiHidden="0" w:defUnhideWhenUsed="0" w:defQFormat="0" w:count="376">
     <w:lsdException w:name="Normal" w:uiPriority="0" w:qFormat="1"/>
     <w:lsdException w:name="heading 1" w:uiPriority="9" w:qFormat="1"/>
-    <w:lsdException w:name="heading 2" w:uiPriority="9" w:semiHidden="1" w:unhideWhenUsed="1" w:qFormat="1"/>
-    <w:lsdException w:name="heading 3" w:uiPriority="9" w:semiHidden="1" w:unhideWhenUsed="1" w:qFormat="1"/>
-    <w:lsdException w:name="heading 4" w:uiPriority="9" w:semiHidden="1" w:unhideWhenUsed="1" w:qFormat="1"/>
-    <w:lsdException w:name="heading 5" w:uiPriority="9" w:semiHidden="1" w:unhideWhenUsed="1" w:qFormat="1"/>
-    <w:lsdException w:name="heading 6" w:uiPriority="9" w:semiHidden="1" w:unhideWhenUsed="1" w:qFormat="1"/>
-    <w:lsdException w:name="heading 7" w:uiPriority="9" w:semiHidden="1" w:unhideWhenUsed="1" w:qFormat="1"/>
-    <w:lsdException w:name="heading 8" w:uiPriority="9" w:semiHidden="1" w:unhideWhenUsed="1" w:qFormat="1"/>
-    <w:lsdException w:name="heading 9" w:uiPriority="9" w:semiHidden="1" w:unhideWhenUsed="1" w:qFormat="1"/>
+    <w:lsdException w:name="heading 2" w:semiHidden="1" w:uiPriority="9" w:unhideWhenUsed="1" w:qFormat="1"/>
+    <w:lsdException w:name="heading 3" w:semiHidden="1" w:uiPriority="9" w:unhideWhenUsed="1" w:qFormat="1"/>
+    <w:lsdException w:name="heading 4" w:semiHidden="1" w:uiPriority="9" w:unhideWhenUsed="1" w:qFormat="1"/>
+    <w:lsdException w:name="heading 5" w:semiHidden="1" w:uiPriority="9" w:unhideWhenUsed="1" w:qFormat="1"/>
+    <w:lsdException w:name="heading 6" w:semiHidden="1" w:uiPriority="9" w:unhideWhenUsed="1" w:qFormat="1"/>
+    <w:lsdException w:name="heading 7" w:semiHidden="1" w:uiPriority="9" w:unhideWhenUsed="1" w:qFormat="1"/>
+    <w:lsdException w:name="heading 8" w:semiHidden="1" w:uiPriority="9" w:unhideWhenUsed="1" w:qFormat="1"/>
+    <w:lsdException w:name="heading 9" w:semiHidden="1" w:uiPriority="9" w:unhideWhenUsed="1" w:qFormat="1"/>
     <w:lsdException w:name="index 1" w:semiHidden="1" w:unhideWhenUsed="1"/>
     <w:lsdException w:name="index 2" w:semiHidden="1" w:unhideWhenUsed="1"/>
     <w:lsdException w:name="index 3" w:semiHidden="1" w:unhideWhenUsed="1"/>
@@ -4484,22 +4708,22 @@
     <w:lsdException w:name="index 7" w:semiHidden="1" w:unhideWhenUsed="1"/>
     <w:lsdException w:name="index 8" w:semiHidden="1" w:unhideWhenUsed="1"/>
     <w:lsdException w:name="index 9" w:semiHidden="1" w:unhideWhenUsed="1"/>
-    <w:lsdException w:name="toc 1" w:uiPriority="39" w:semiHidden="1" w:unhideWhenUsed="1"/>
-    <w:lsdException w:name="toc 2" w:uiPriority="39" w:semiHidden="1" w:unhideWhenUsed="1"/>
-    <w:lsdException w:name="toc 3" w:uiPriority="39" w:semiHidden="1" w:unhideWhenUsed="1"/>
-    <w:lsdException w:name="toc 4" w:uiPriority="39" w:semiHidden="1" w:unhideWhenUsed="1"/>
-    <w:lsdException w:name="toc 5" w:uiPriority="39" w:semiHidden="1" w:unhideWhenUsed="1"/>
-    <w:lsdException w:name="toc 6" w:uiPriority="39" w:semiHidden="1" w:unhideWhenUsed="1"/>
-    <w:lsdException w:name="toc 7" w:uiPriority="39" w:semiHidden="1" w:unhideWhenUsed="1"/>
-    <w:lsdException w:name="toc 8" w:uiPriority="39" w:semiHidden="1" w:unhideWhenUsed="1"/>
-    <w:lsdException w:name="toc 9" w:uiPriority="39" w:semiHidden="1" w:unhideWhenUsed="1"/>
+    <w:lsdException w:name="toc 1" w:semiHidden="1" w:uiPriority="39" w:unhideWhenUsed="1"/>
+    <w:lsdException w:name="toc 2" w:semiHidden="1" w:uiPriority="39" w:unhideWhenUsed="1"/>
+    <w:lsdException w:name="toc 3" w:semiHidden="1" w:uiPriority="39" w:unhideWhenUsed="1"/>
+    <w:lsdException w:name="toc 4" w:semiHidden="1" w:uiPriority="39" w:unhideWhenUsed="1"/>
+    <w:lsdException w:name="toc 5" w:semiHidden="1" w:uiPriority="39" w:unhideWhenUsed="1"/>
+    <w:lsdException w:name="toc 6" w:semiHidden="1" w:uiPriority="39" w:unhideWhenUsed="1"/>
+    <w:lsdException w:name="toc 7" w:semiHidden="1" w:uiPriority="39" w:unhideWhenUsed="1"/>
+    <w:lsdException w:name="toc 8" w:semiHidden="1" w:uiPriority="39" w:unhideWhenUsed="1"/>
+    <w:lsdException w:name="toc 9" w:semiHidden="1" w:uiPriority="39" w:unhideWhenUsed="1"/>
     <w:lsdException w:name="Normal Indent" w:semiHidden="1" w:unhideWhenUsed="1"/>
     <w:lsdException w:name="footnote text" w:semiHidden="1" w:unhideWhenUsed="1"/>
     <w:lsdException w:name="annotation text" w:semiHidden="1" w:unhideWhenUsed="1"/>
     <w:lsdException w:name="header" w:semiHidden="1" w:unhideWhenUsed="1"/>
     <w:lsdException w:name="footer" w:semiHidden="1" w:unhideWhenUsed="1"/>
     <w:lsdException w:name="index heading" w:semiHidden="1" w:unhideWhenUsed="1"/>
-    <w:lsdException w:name="caption" w:uiPriority="35" w:semiHidden="1" w:unhideWhenUsed="1" w:qFormat="1"/>
+    <w:lsdException w:name="caption" w:semiHidden="1" w:uiPriority="35" w:unhideWhenUsed="1" w:qFormat="1"/>
     <w:lsdException w:name="table of figures" w:semiHidden="1" w:unhideWhenUsed="1"/>
     <w:lsdException w:name="envelope address" w:semiHidden="1" w:unhideWhenUsed="1"/>
     <w:lsdException w:name="envelope return" w:semiHidden="1" w:unhideWhenUsed="1"/>
@@ -4530,7 +4754,7 @@
     <w:lsdException w:name="Title" w:uiPriority="10" w:qFormat="1"/>
     <w:lsdException w:name="Closing" w:semiHidden="1" w:unhideWhenUsed="1"/>
     <w:lsdException w:name="Signature" w:semiHidden="1" w:unhideWhenUsed="1"/>
-    <w:lsdException w:name="Default Paragraph Font" w:uiPriority="1" w:semiHidden="1" w:unhideWhenUsed="1"/>
+    <w:lsdException w:name="Default Paragraph Font" w:semiHidden="1" w:uiPriority="1" w:unhideWhenUsed="1"/>
     <w:lsdException w:name="Body Text" w:semiHidden="1" w:unhideWhenUsed="1"/>
     <w:lsdException w:name="Body Text Indent" w:semiHidden="1" w:unhideWhenUsed="1"/>
     <w:lsdException w:name="List Continue" w:semiHidden="1" w:unhideWhenUsed="1"/>
@@ -4730,8 +4954,8 @@
     <w:lsdException w:name="Subtle Reference" w:uiPriority="31" w:qFormat="1"/>
     <w:lsdException w:name="Intense Reference" w:uiPriority="32" w:qFormat="1"/>
     <w:lsdException w:name="Book Title" w:uiPriority="33" w:qFormat="1"/>
-    <w:lsdException w:name="Bibliography" w:uiPriority="37" w:semiHidden="1" w:unhideWhenUsed="1"/>
-    <w:lsdException w:name="TOC Heading" w:uiPriority="39" w:semiHidden="1" w:unhideWhenUsed="1" w:qFormat="1"/>
+    <w:lsdException w:name="Bibliography" w:semiHidden="1" w:uiPriority="37" w:unhideWhenUsed="1"/>
+    <w:lsdException w:name="TOC Heading" w:semiHidden="1" w:uiPriority="39" w:unhideWhenUsed="1" w:qFormat="1"/>
     <w:lsdException w:name="Plain Table 1" w:uiPriority="41"/>
     <w:lsdException w:name="Plain Table 2" w:uiPriority="42"/>
     <w:lsdException w:name="Plain Table 3" w:uiPriority="43"/>
@@ -4842,11 +5066,11 @@
     <w:lsdException w:name="Unresolved Mention" w:semiHidden="1" w:unhideWhenUsed="1"/>
     <w:lsdException w:name="Smart Link" w:semiHidden="1" w:unhideWhenUsed="1"/>
   </w:latentStyles>
-  <w:style w:type="paragraph" w:styleId="Normal" w:default="1">
+  <w:style w:type="paragraph" w:default="1" w:styleId="Normal">
     <w:name w:val="Normal"/>
     <w:qFormat/>
     <w:rPr>
-      <w:rFonts w:ascii="Courier New" w:hAnsi="Courier New" w:eastAsia="Courier New" w:cs="Courier New"/>
+      <w:rFonts w:ascii="Courier New" w:eastAsia="Courier New" w:hAnsi="Courier New" w:cs="Courier New"/>
       <w:lang w:val="pt-PT"/>
     </w:rPr>
   </w:style>
@@ -4860,19 +5084,19 @@
       <w:outlineLvl w:val="0"/>
     </w:pPr>
     <w:rPr>
-      <w:rFonts w:ascii="Arial" w:hAnsi="Arial" w:eastAsia="Arial" w:cs="Arial"/>
+      <w:rFonts w:ascii="Arial" w:eastAsia="Arial" w:hAnsi="Arial" w:cs="Arial"/>
       <w:b/>
       <w:bCs/>
       <w:sz w:val="20"/>
       <w:szCs w:val="20"/>
     </w:rPr>
   </w:style>
-  <w:style w:type="character" w:styleId="Fontepargpadro" w:default="1">
+  <w:style w:type="character" w:default="1" w:styleId="Fontepargpadro">
     <w:name w:val="Default Paragraph Font"/>
     <w:uiPriority w:val="1"/>
     <w:unhideWhenUsed/>
   </w:style>
-  <w:style w:type="table" w:styleId="Tabelanormal" w:default="1">
+  <w:style w:type="table" w:default="1" w:styleId="Tabelanormal">
     <w:name w:val="Normal Table"/>
     <w:uiPriority w:val="99"/>
     <w:semiHidden/>
@@ -4887,13 +5111,13 @@
       </w:tblCellMar>
     </w:tblPr>
   </w:style>
-  <w:style w:type="numbering" w:styleId="Semlista" w:default="1">
+  <w:style w:type="numbering" w:default="1" w:styleId="Semlista">
     <w:name w:val="No List"/>
     <w:uiPriority w:val="99"/>
     <w:semiHidden/>
     <w:unhideWhenUsed/>
   </w:style>
-  <w:style w:type="table" w:styleId="TableNormal" w:customStyle="1">
+  <w:style w:type="table" w:customStyle="1" w:styleId="TableNormal">
     <w:name w:val="Table Normal"/>
     <w:uiPriority w:val="2"/>
     <w:semiHidden/>
@@ -4932,7 +5156,7 @@
       <w:jc w:val="center"/>
     </w:pPr>
     <w:rPr>
-      <w:rFonts w:ascii="Arial Narrow" w:hAnsi="Arial Narrow" w:eastAsia="Arial Narrow" w:cs="Arial Narrow"/>
+      <w:rFonts w:ascii="Arial Narrow" w:eastAsia="Arial Narrow" w:hAnsi="Arial Narrow" w:cs="Arial Narrow"/>
       <w:b/>
       <w:bCs/>
       <w:sz w:val="40"/>
@@ -4945,7 +5169,7 @@
     <w:uiPriority w:val="1"/>
     <w:qFormat/>
   </w:style>
-  <w:style w:type="paragraph" w:styleId="TableParagraph" w:customStyle="1">
+  <w:style w:type="paragraph" w:customStyle="1" w:styleId="TableParagraph">
     <w:name w:val="Table Paragraph"/>
     <w:basedOn w:val="Normal"/>
     <w:uiPriority w:val="1"/>
@@ -4976,14 +5200,14 @@
       </w:tabs>
     </w:pPr>
   </w:style>
-  <w:style w:type="character" w:styleId="CabealhoChar" w:customStyle="1">
+  <w:style w:type="character" w:customStyle="1" w:styleId="CabealhoChar">
     <w:name w:val="Cabeçalho Char"/>
     <w:basedOn w:val="Fontepargpadro"/>
     <w:link w:val="Cabealho"/>
     <w:uiPriority w:val="99"/>
     <w:rsid w:val="00607DA2"/>
     <w:rPr>
-      <w:rFonts w:ascii="Courier New" w:hAnsi="Courier New" w:eastAsia="Courier New" w:cs="Courier New"/>
+      <w:rFonts w:ascii="Courier New" w:eastAsia="Courier New" w:hAnsi="Courier New" w:cs="Courier New"/>
       <w:lang w:val="pt-PT"/>
     </w:rPr>
   </w:style>
@@ -5001,14 +5225,14 @@
       </w:tabs>
     </w:pPr>
   </w:style>
-  <w:style w:type="character" w:styleId="RodapChar" w:customStyle="1">
+  <w:style w:type="character" w:customStyle="1" w:styleId="RodapChar">
     <w:name w:val="Rodapé Char"/>
     <w:basedOn w:val="Fontepargpadro"/>
     <w:link w:val="Rodap"/>
     <w:uiPriority w:val="99"/>
     <w:rsid w:val="00607DA2"/>
     <w:rPr>
-      <w:rFonts w:ascii="Courier New" w:hAnsi="Courier New" w:eastAsia="Courier New" w:cs="Courier New"/>
+      <w:rFonts w:ascii="Courier New" w:eastAsia="Courier New" w:hAnsi="Courier New" w:cs="Courier New"/>
       <w:lang w:val="pt-PT"/>
     </w:rPr>
   </w:style>
@@ -5019,12 +5243,12 @@
     <w:rsid w:val="003D5C0E"/>
     <w:tblPr>
       <w:tblBorders>
-        <w:top w:val="single" w:color="auto" w:sz="4" w:space="0"/>
-        <w:left w:val="single" w:color="auto" w:sz="4" w:space="0"/>
-        <w:bottom w:val="single" w:color="auto" w:sz="4" w:space="0"/>
-        <w:right w:val="single" w:color="auto" w:sz="4" w:space="0"/>
-        <w:insideH w:val="single" w:color="auto" w:sz="4" w:space="0"/>
-        <w:insideV w:val="single" w:color="auto" w:sz="4" w:space="0"/>
+        <w:top w:val="single" w:sz="4" w:space="0" w:color="auto"/>
+        <w:left w:val="single" w:sz="4" w:space="0" w:color="auto"/>
+        <w:bottom w:val="single" w:sz="4" w:space="0" w:color="auto"/>
+        <w:right w:val="single" w:sz="4" w:space="0" w:color="auto"/>
+        <w:insideH w:val="single" w:sz="4" w:space="0" w:color="auto"/>
+        <w:insideV w:val="single" w:sz="4" w:space="0" w:color="auto"/>
       </w:tblBorders>
     </w:tblPr>
   </w:style>

</xml_diff>